<commit_message>
docs: align TCC2 with approved prenatal API architecture
</commit_message>
<xml_diff>
--- a/docs/TCC2_MESTRE_Harliton_Martins.docx
+++ b/docs/TCC2_MESTRE_Harliton_Martins.docx
@@ -14129,6 +14129,24 @@
     </w:p>
     <w:p>
       <w:pPr>
+        <w:pStyle w:val="Normal"/>
+        <w:spacing w:lineRule="auto" w:line="360" w:before="0" w:after="0"/>
+        <w:ind w:firstLine="709"/>
+        <w:jc w:val="both"/>
+        <w:rPr/>
+      </w:pPr>
+      <w:r>
+        <w:rPr>
+          <w:rFonts w:eastAsia="Times New Roman"/>
+          <w:b w:val="false"/>
+          <w:i w:val="false"/>
+          <w:sz w:val="24"/>
+        </w:rPr>
+        <w:t xml:space="preserve">A arquitetura aqui descrita corresponde ao estado implementado. Distingue-se, portanto, a API DSS atual (que recebe a estimativa experimental, stateless) de uma futura API CRUD do acompanhamento pré-natal, prevista na arquitetura aprovada (seção 4.7) e ainda não implementada.</w:t>
+      </w:r>
+    </w:p>
+    <w:p>
+      <w:pPr>
         <w:pStyle w:val="Heading2"/>
         <w:ind w:hanging="0"/>
         <w:jc w:val="start"/>
@@ -15477,25 +15495,7 @@
           <w:i/>
           <w:sz w:val="20"/>
         </w:rPr>
-        <w:t>a arquitetura futura (seção 5.6).</w:t>
-      </w:r>
-    </w:p>
-    <w:p>
-      <w:pPr>
-        <w:pStyle w:val="Heading2"/>
-        <w:ind w:hanging="0"/>
-        <w:jc w:val="start"/>
-        <w:rPr/>
-      </w:pPr>
-      <w:bookmarkStart w:id="39" w:name="__RefHeading___Toc2235_3157870603"/>
-      <w:bookmarkEnd w:id="39"/>
-      <w:r>
-        <w:rPr>
-          <w:rFonts w:eastAsia="Times New Roman" w:ascii="Times New Roman" w:hAnsi="Times New Roman"/>
-          <w:b/>
-          <w:sz w:val="24"/>
-        </w:rPr>
-        <w:t>4.5 Autenticação e estado atual do DSS</w:t>
+        <w:t xml:space="preserve">a arquitetura futura (seção 4.7).</w:t>
       </w:r>
     </w:p>
     <w:p>
@@ -15513,79 +15513,25 @@
           <w:i w:val="false"/>
           <w:sz w:val="24"/>
         </w:rPr>
-        <w:t xml:space="preserve">O aplicativo possui uma </w:t>
-      </w:r>
-      <w:r>
-        <w:rPr>
-          <w:rFonts w:eastAsia="Times New Roman"/>
-          <w:b/>
-          <w:i w:val="false"/>
-          <w:sz w:val="24"/>
-        </w:rPr>
-        <w:t>tela visual de login</w:t>
-      </w:r>
-      <w:r>
-        <w:rPr>
-          <w:rFonts w:eastAsia="Times New Roman"/>
-          <w:b w:val="false"/>
-          <w:i w:val="false"/>
-          <w:sz w:val="24"/>
-        </w:rPr>
-        <w:t xml:space="preserve">; entretanto, </w:t>
-      </w:r>
-      <w:r>
-        <w:rPr>
-          <w:rFonts w:eastAsia="Times New Roman"/>
-          <w:b/>
-          <w:i w:val="false"/>
-          <w:sz w:val="24"/>
-        </w:rPr>
-        <w:t>não existe um fluxo funcional completo de autenticação e sessão</w:t>
-      </w:r>
-      <w:r>
-        <w:rPr>
-          <w:rFonts w:eastAsia="Times New Roman"/>
-          <w:b w:val="false"/>
-          <w:i w:val="false"/>
-          <w:sz w:val="24"/>
-        </w:rPr>
-        <w:t xml:space="preserve">. O botão "Entrar" atualmente navega sem autenticar de fato; o botão "Criar nova conta" direciona ao questionário DSS e </w:t>
-      </w:r>
-      <w:r>
-        <w:rPr>
-          <w:rFonts w:eastAsia="Times New Roman"/>
-          <w:b/>
-          <w:i w:val="false"/>
-          <w:sz w:val="24"/>
-        </w:rPr>
-        <w:t>não</w:t>
-      </w:r>
-      <w:r>
-        <w:rPr>
-          <w:rFonts w:eastAsia="Times New Roman"/>
-          <w:b w:val="false"/>
-          <w:i w:val="false"/>
-          <w:sz w:val="24"/>
-        </w:rPr>
-        <w:t xml:space="preserve"> cria conta. Existe código parcial/legado de autenticação (repositório de usuário, serviço de login e armazenamento de token), mas ele </w:t>
-      </w:r>
-      <w:r>
-        <w:rPr>
-          <w:rFonts w:eastAsia="Times New Roman"/>
-          <w:b/>
-          <w:i w:val="false"/>
-          <w:sz w:val="24"/>
-        </w:rPr>
-        <w:t>não</w:t>
-      </w:r>
-      <w:r>
-        <w:rPr>
-          <w:rFonts w:eastAsia="Times New Roman"/>
-          <w:b w:val="false"/>
-          <w:i w:val="false"/>
-          <w:sz w:val="24"/>
-        </w:rPr>
-        <w:t xml:space="preserve"> compõe um sistema real completo de autenticação/sessão.</w:t>
+        <w:t xml:space="preserve">A estratégia de evolução aprovada para a persistência do acompanhamento prevê que a API/backend passe a ser a fonte de verdade, substituindo progressivamente a dependência do SQLite local. A transição será feature por feature: cada recurso migra da implementação local para uma implementação REST, validada de ponta a ponta, e só então a API passa a ser a fonte de verdade daquela feature. Não haverá, nesta etapa, migração automática dos registros SQLite existentes, nem offline-first, sincronização ou cache distribuído (seção 4.7).</w:t>
+      </w:r>
+    </w:p>
+    <w:p>
+      <w:pPr>
+        <w:pStyle w:val="Heading2"/>
+        <w:ind w:hanging="0"/>
+        <w:jc w:val="start"/>
+        <w:rPr/>
+      </w:pPr>
+      <w:bookmarkStart w:id="39" w:name="__RefHeading___Toc2235_3157870603"/>
+      <w:bookmarkEnd w:id="39"/>
+      <w:r>
+        <w:rPr>
+          <w:rFonts w:eastAsia="Times New Roman" w:ascii="Times New Roman" w:hAnsi="Times New Roman"/>
+          <w:b/>
+          <w:sz w:val="24"/>
+        </w:rPr>
+        <w:t>4.5 Autenticação e estado atual do DSS</w:t>
       </w:r>
     </w:p>
     <w:p>
@@ -15603,6 +15549,96 @@
           <w:i w:val="false"/>
           <w:sz w:val="24"/>
         </w:rPr>
+        <w:t xml:space="preserve">O aplicativo possui uma </w:t>
+      </w:r>
+      <w:r>
+        <w:rPr>
+          <w:rFonts w:eastAsia="Times New Roman"/>
+          <w:b/>
+          <w:i w:val="false"/>
+          <w:sz w:val="24"/>
+        </w:rPr>
+        <w:t>tela visual de login</w:t>
+      </w:r>
+      <w:r>
+        <w:rPr>
+          <w:rFonts w:eastAsia="Times New Roman"/>
+          <w:b w:val="false"/>
+          <w:i w:val="false"/>
+          <w:sz w:val="24"/>
+        </w:rPr>
+        <w:t xml:space="preserve">; entretanto, </w:t>
+      </w:r>
+      <w:r>
+        <w:rPr>
+          <w:rFonts w:eastAsia="Times New Roman"/>
+          <w:b/>
+          <w:i w:val="false"/>
+          <w:sz w:val="24"/>
+        </w:rPr>
+        <w:t>não existe um fluxo funcional completo de autenticação e sessão</w:t>
+      </w:r>
+      <w:r>
+        <w:rPr>
+          <w:rFonts w:eastAsia="Times New Roman"/>
+          <w:b w:val="false"/>
+          <w:i w:val="false"/>
+          <w:sz w:val="24"/>
+        </w:rPr>
+        <w:t xml:space="preserve">. O botão "Entrar" atualmente navega sem autenticar de fato; o botão "Criar nova conta" direciona ao questionário DSS e </w:t>
+      </w:r>
+      <w:r>
+        <w:rPr>
+          <w:rFonts w:eastAsia="Times New Roman"/>
+          <w:b/>
+          <w:i w:val="false"/>
+          <w:sz w:val="24"/>
+        </w:rPr>
+        <w:t>não</w:t>
+      </w:r>
+      <w:r>
+        <w:rPr>
+          <w:rFonts w:eastAsia="Times New Roman"/>
+          <w:b w:val="false"/>
+          <w:i w:val="false"/>
+          <w:sz w:val="24"/>
+        </w:rPr>
+        <w:t xml:space="preserve"> cria conta. Existe código parcial/legado de autenticação (repositório de usuário, serviço de login e armazenamento de token), mas ele </w:t>
+      </w:r>
+      <w:r>
+        <w:rPr>
+          <w:rFonts w:eastAsia="Times New Roman"/>
+          <w:b/>
+          <w:i w:val="false"/>
+          <w:sz w:val="24"/>
+        </w:rPr>
+        <w:t>não</w:t>
+      </w:r>
+      <w:r>
+        <w:rPr>
+          <w:rFonts w:eastAsia="Times New Roman"/>
+          <w:b w:val="false"/>
+          <w:i w:val="false"/>
+          <w:sz w:val="24"/>
+        </w:rPr>
+        <w:t xml:space="preserve"> compõe um sistema real completo de autenticação/sessão.</w:t>
+      </w:r>
+    </w:p>
+    <w:p>
+      <w:pPr>
+        <w:pStyle w:val="Normal"/>
+        <w:spacing w:lineRule="auto" w:line="360" w:before="0" w:after="0"/>
+        <w:ind w:firstLine="709"/>
+        <w:jc w:val="both"/>
+        <w:rPr/>
+      </w:pPr>
+      <w:r>
+        <w:rPr>
+          <w:rFonts w:eastAsia="Times New Roman"/>
+          <w:b w:val="false"/>
+          <w:i w:val="false"/>
+          <w:sz w:val="24"/>
+        </w:rPr>
         <w:t xml:space="preserve">O fluxo DSS atual é </w:t>
       </w:r>
       <w:r>
@@ -15799,6 +15835,24 @@
           <w:sz w:val="20"/>
         </w:rPr>
         <w:t>completos.</w:t>
+      </w:r>
+    </w:p>
+    <w:p>
+      <w:pPr>
+        <w:pStyle w:val="Normal"/>
+        <w:spacing w:lineRule="auto" w:line="360" w:before="0" w:after="0"/>
+        <w:ind w:firstLine="709"/>
+        <w:jc w:val="both"/>
+        <w:rPr/>
+      </w:pPr>
+      <w:r>
+        <w:rPr>
+          <w:rFonts w:eastAsia="Times New Roman"/>
+          <w:b w:val="false"/>
+          <w:i w:val="false"/>
+          <w:sz w:val="24"/>
+        </w:rPr>
+        <w:t xml:space="preserve">A arquitetura futura aprovada prevê autenticação real — cadastro, login, sessão, token de acesso e token de renovação, com hash de senha moderno — e a relação USER ↔ GESTANTE, com autorização por ownership. Distinguem-se autenticação (quem é a usuária) de autorização (quais registros ela pode acessar); o CPF, quando utilizado, pertence ao perfil da gestante e não é chave primária nem login automático. Tudo isso permanece planejado, e não implementado (seção 4.7).</w:t>
       </w:r>
     </w:p>
     <w:p>
@@ -16020,7 +16074,7 @@
           <w:b/>
           <w:sz w:val="24"/>
         </w:rPr>
-        <w:t>4.7 Arquitetura futura proposta (evolução)</w:t>
+        <w:t xml:space="preserve">4.7 Arquitetura futura aprovada (evolução planejada)</w:t>
       </w:r>
     </w:p>
     <w:p>
@@ -16038,61 +16092,7 @@
           <w:i w:val="false"/>
           <w:sz w:val="24"/>
         </w:rPr>
-        <w:t xml:space="preserve">A arquitetura descrita até aqui corresponde ao </w:t>
-      </w:r>
-      <w:r>
-        <w:rPr>
-          <w:rFonts w:eastAsia="Times New Roman"/>
-          <w:b/>
-          <w:i w:val="false"/>
-          <w:sz w:val="24"/>
-        </w:rPr>
-        <w:t>estado atual implementado</w:t>
-      </w:r>
-      <w:r>
-        <w:rPr>
-          <w:rFonts w:eastAsia="Times New Roman"/>
-          <w:b w:val="false"/>
-          <w:i w:val="false"/>
-          <w:sz w:val="24"/>
-        </w:rPr>
-        <w:t xml:space="preserve">. A seguir apresenta-se uma </w:t>
-      </w:r>
-      <w:r>
-        <w:rPr>
-          <w:rFonts w:eastAsia="Times New Roman"/>
-          <w:b/>
-          <w:i w:val="false"/>
-          <w:sz w:val="24"/>
-        </w:rPr>
-        <w:t>evolução arquitetural proposta</w:t>
-      </w:r>
-      <w:r>
-        <w:rPr>
-          <w:rFonts w:eastAsia="Times New Roman"/>
-          <w:b w:val="false"/>
-          <w:i w:val="false"/>
-          <w:sz w:val="24"/>
-        </w:rPr>
-        <w:t xml:space="preserve">, </w:t>
-      </w:r>
-      <w:r>
-        <w:rPr>
-          <w:rFonts w:eastAsia="Times New Roman"/>
-          <w:b/>
-          <w:i w:val="false"/>
-          <w:sz w:val="24"/>
-        </w:rPr>
-        <w:t>ainda não implementada</w:t>
-      </w:r>
-      <w:r>
-        <w:rPr>
-          <w:rFonts w:eastAsia="Times New Roman"/>
-          <w:b w:val="false"/>
-          <w:i w:val="false"/>
-          <w:sz w:val="24"/>
-        </w:rPr>
-        <w:t>, que será detalhada em etapa posterior de modelagem de backend e identidade.</w:t>
+        <w:t xml:space="preserve">A arquitetura descrita até aqui corresponde ao estado atual implementado — o módulo de acompanhamento do pré-natal persiste localmente em SQLite, e o fluxo DSS utiliza a API apenas para a estimativa experimental, de forma stateless. A seguir apresenta-se a arquitetura futura aprovada, planejada mas ainda não implementada, que estabelece a direção de evolução da persistência e da identidade do acompanhamento pré-natal.</w:t>
       </w:r>
     </w:p>
     <w:p>
@@ -16110,7 +16110,7 @@
           <w:i w:val="false"/>
           <w:sz w:val="24"/>
         </w:rPr>
-        <w:t>Conceitualmente, o domínio evoluiria para as seguintes entidades e relacionamentos:</w:t>
+        <w:t xml:space="preserve">Conceitualmente, o domínio evoluirá para as seguintes entidades e relacionamentos:</w:t>
       </w:r>
     </w:p>
     <w:p>
@@ -16124,25 +16124,23 @@
           <w:rFonts w:eastAsia="Courier New"/>
           <w:sz w:val="18"/>
         </w:rPr>
-        <w:t>USER</w:t>
+        <w:t xml:space="preserve">USER 1 ─ 1 GESTANTE</w:t>
         <w:br/>
-        <w:t xml:space="preserve">  └── GESTANTE</w:t>
+        <w:t xml:space="preserve">GESTANTE 1 ─ N GESTACAO</w:t>
         <w:br/>
-        <w:t xml:space="preserve">        ├── HISTORICO_OBSTETRICO</w:t>
+        <w:t xml:space="preserve">GESTANTE 1 ─ 1 HISTORICO_OBSTETRICO</w:t>
         <w:br/>
-        <w:t xml:space="preserve">        └── GESTACAO</w:t>
+        <w:t xml:space="preserve">GESTACAO 1 ─ N CONSULTA</w:t>
         <w:br/>
-        <w:t xml:space="preserve">              ├── CONSULTA</w:t>
+        <w:t xml:space="preserve">GESTACAO 1 ─ N EXAME</w:t>
         <w:br/>
-        <w:t xml:space="preserve">              ├── EXAME</w:t>
+        <w:t xml:space="preserve">GESTACAO 1 ─ N MEDICACAO</w:t>
         <w:br/>
-        <w:t xml:space="preserve">              ├── MEDICACAO</w:t>
+        <w:t xml:space="preserve">GESTACAO 1 ─ N VACINA</w:t>
         <w:br/>
-        <w:t xml:space="preserve">              ├── VACINA (checklist)</w:t>
+        <w:t xml:space="preserve">GESTACAO 1 ─ 0..1 PLANO_DE_PARTO</w:t>
         <w:br/>
-        <w:t xml:space="preserve">              ├── PLANO_DE_PARTO</w:t>
-        <w:br/>
-        <w:t xml:space="preserve">              └── AVALIACAO_DSS</w:t>
+        <w:t xml:space="preserve">GESTACAO 1 ─ N AVALIACAO_DSS</w:t>
       </w:r>
     </w:p>
     <w:p>
@@ -16160,151 +16158,61 @@
           <w:i w:val="false"/>
           <w:sz w:val="24"/>
         </w:rPr>
-        <w:t xml:space="preserve">Nessa proposta, </w:t>
-      </w:r>
-      <w:r>
-        <w:rPr>
-          <w:rFonts w:eastAsia="Courier New" w:ascii="Courier New" w:hAnsi="Courier New"/>
-          <w:b w:val="false"/>
-          <w:i w:val="false"/>
-          <w:sz w:val="22"/>
-        </w:rPr>
-        <w:t>USER</w:t>
-      </w:r>
-      <w:r>
-        <w:rPr>
-          <w:rFonts w:eastAsia="Times New Roman"/>
-          <w:b w:val="false"/>
-          <w:i w:val="false"/>
-          <w:sz w:val="24"/>
-        </w:rPr>
-        <w:t xml:space="preserve"> representa a conta/autenticação e </w:t>
-      </w:r>
-      <w:r>
-        <w:rPr>
-          <w:rFonts w:eastAsia="Courier New" w:ascii="Courier New" w:hAnsi="Courier New"/>
-          <w:b w:val="false"/>
-          <w:i w:val="false"/>
-          <w:sz w:val="22"/>
-        </w:rPr>
-        <w:t>GESTANTE</w:t>
-      </w:r>
-      <w:r>
-        <w:rPr>
-          <w:rFonts w:eastAsia="Times New Roman"/>
-          <w:b w:val="false"/>
-          <w:i w:val="false"/>
-          <w:sz w:val="24"/>
-        </w:rPr>
-        <w:t xml:space="preserve"> o perfil pessoal (nome, nome social, data de nascimento, CPF — se utilizado — e Cartão Nacional de Saúde). O </w:t>
-      </w:r>
-      <w:r>
-        <w:rPr>
-          <w:rFonts w:eastAsia="Times New Roman"/>
-          <w:b/>
-          <w:i w:val="false"/>
-          <w:sz w:val="24"/>
-        </w:rPr>
-        <w:t>histórico obstétrico</w:t>
-      </w:r>
-      <w:r>
-        <w:rPr>
-          <w:rFonts w:eastAsia="Times New Roman"/>
-          <w:b w:val="false"/>
-          <w:i w:val="false"/>
-          <w:sz w:val="24"/>
-        </w:rPr>
-        <w:t xml:space="preserve"> atual (números agregados de gravidezes, partos e abortos) não representa uma gestação anterior individual e seria modelado como </w:t>
-      </w:r>
-      <w:r>
-        <w:rPr>
-          <w:rFonts w:eastAsia="Courier New" w:ascii="Courier New" w:hAnsi="Courier New"/>
-          <w:b w:val="false"/>
-          <w:i w:val="false"/>
-          <w:sz w:val="22"/>
-        </w:rPr>
-        <w:t>HISTORICO_OBSTETRICO</w:t>
-      </w:r>
-      <w:r>
-        <w:rPr>
-          <w:rFonts w:eastAsia="Times New Roman"/>
-          <w:b w:val="false"/>
-          <w:i w:val="false"/>
-          <w:sz w:val="24"/>
-        </w:rPr>
-        <w:t xml:space="preserve">. Cada </w:t>
-      </w:r>
-      <w:r>
-        <w:rPr>
-          <w:rFonts w:eastAsia="Courier New" w:ascii="Courier New" w:hAnsi="Courier New"/>
-          <w:b w:val="false"/>
-          <w:i w:val="false"/>
-          <w:sz w:val="22"/>
-        </w:rPr>
-        <w:t>GESTACAO</w:t>
-      </w:r>
-      <w:r>
-        <w:rPr>
-          <w:rFonts w:eastAsia="Times New Roman"/>
-          <w:b w:val="false"/>
-          <w:i w:val="false"/>
-          <w:sz w:val="24"/>
-        </w:rPr>
-        <w:t xml:space="preserve"> teria identidade própria, e as entidades do pré-natal (consultas, exames, medicamentos, vacinas, plano de parto e avaliação DSS) ficariam associadas à gestação. A persistência em </w:t>
-      </w:r>
-      <w:r>
-        <w:rPr>
-          <w:rFonts w:eastAsia="Times New Roman"/>
-          <w:b/>
-          <w:i w:val="false"/>
-          <w:sz w:val="24"/>
-        </w:rPr>
-        <w:t>PostgreSQL</w:t>
-      </w:r>
-      <w:r>
-        <w:rPr>
-          <w:rFonts w:eastAsia="Times New Roman"/>
-          <w:b w:val="false"/>
-          <w:i w:val="false"/>
-          <w:sz w:val="24"/>
-        </w:rPr>
-        <w:t xml:space="preserve"> e a autenticação são </w:t>
-      </w:r>
-      <w:r>
-        <w:rPr>
-          <w:rFonts w:eastAsia="Times New Roman"/>
-          <w:b/>
-          <w:i w:val="false"/>
-          <w:sz w:val="24"/>
-        </w:rPr>
-        <w:t>propostas futuras</w:t>
-      </w:r>
-      <w:r>
-        <w:rPr>
-          <w:rFonts w:eastAsia="Times New Roman"/>
-          <w:b w:val="false"/>
-          <w:i w:val="false"/>
-          <w:sz w:val="24"/>
-        </w:rPr>
-        <w:t xml:space="preserve"> — o estado atual do gerenciamento pré-natal permanece em </w:t>
-      </w:r>
-      <w:r>
-        <w:rPr>
-          <w:rFonts w:eastAsia="Times New Roman"/>
-          <w:b/>
-          <w:i w:val="false"/>
-          <w:sz w:val="24"/>
-        </w:rPr>
-        <w:t>SQLite local</w:t>
-      </w:r>
-      <w:r>
-        <w:rPr>
-          <w:rFonts w:eastAsia="Times New Roman"/>
-          <w:b w:val="false"/>
-          <w:i w:val="false"/>
-          <w:sz w:val="24"/>
-        </w:rPr>
-        <w:t>.</w:t>
+        <w:t xml:space="preserve">Nessa arquitetura, USER representa a identidade/autenticação e GESTANTE o perfil pessoal (nome, nome social, data de nascimento, CPF — se utilizado — e Cartão Nacional de Saúde). O histórico obstétrico atual (números agregados de gravidezes, partos e abortos) pertence à GESTANTE e não representa uma gestação anterior individual, sendo modelado como HISTORICO_OBSTETRICO. Cada GESTACAO possui identidade própria, e as entidades do pré-natal (consultas, exames, medicamentos, vacinas, plano de parto e avaliação DSS) ficam associadas à gestação.</w:t>
+      </w:r>
+    </w:p>
+    <w:p>
+      <w:pPr>
+        <w:pStyle w:val="Normal"/>
+        <w:spacing w:lineRule="auto" w:line="360" w:before="0" w:after="0"/>
+        <w:ind w:firstLine="709"/>
+        <w:jc w:val="both"/>
+        <w:rPr/>
+      </w:pPr>
+      <w:r>
+        <w:rPr>
+          <w:rFonts w:eastAsia="Times New Roman"/>
+          <w:b w:val="false"/>
+          <w:i w:val="false"/>
+          <w:sz w:val="24"/>
+        </w:rPr>
+        <w:t xml:space="preserve">A persistência futura aprovada prevê PostgreSQL como banco, SQLAlchemy 2.x como camada ORM e Alembic para migrações versionadas, com integridade referencial formal (chaves estrangeiras), timestamps e identificadores UUID v4 para as novas entidades persistentes. O modo de acesso do ORM (síncrono ou assíncrono) ainda não está definido e será avaliado na etapa de infraestrutura. O CPF, quando utilizado, pertence ao perfil da gestante e não é chave primária nem credencial de login automática.</w:t>
+      </w:r>
+    </w:p>
+    <w:p>
+      <w:pPr>
+        <w:pStyle w:val="Normal"/>
+        <w:spacing w:lineRule="auto" w:line="360" w:before="0" w:after="0"/>
+        <w:ind w:firstLine="709"/>
+        <w:jc w:val="both"/>
+        <w:rPr/>
+      </w:pPr>
+      <w:r>
+        <w:rPr>
+          <w:rFonts w:eastAsia="Times New Roman"/>
+          <w:b w:val="false"/>
+          <w:i w:val="false"/>
+          <w:sz w:val="24"/>
+        </w:rPr>
+        <w:t xml:space="preserve">A API/backend passará a ser a fonte de verdade do acompanhamento pré-natal, com autenticação (cadastro, login e sessão) e autorização por ownership, aplicada pelo caminho USER → GESTANTE → GESTACAO → recurso, para impedir o acesso a registros de outra usuária. Distinguem-se, assim, autenticação ("quem é a usuária") de autorização ("quais registros ela pode acessar"); trata-se de controle de propriedade/autorização, e não de "multi-tenancy".</w:t>
+      </w:r>
+    </w:p>
+    <w:p>
+      <w:pPr>
+        <w:pStyle w:val="Normal"/>
+        <w:spacing w:lineRule="auto" w:line="360" w:before="0" w:after="0"/>
+        <w:ind w:firstLine="709"/>
+        <w:jc w:val="both"/>
+        <w:rPr/>
+      </w:pPr>
+      <w:r>
+        <w:rPr>
+          <w:rFonts w:eastAsia="Times New Roman"/>
+          <w:b w:val="false"/>
+          <w:i w:val="false"/>
+          <w:sz w:val="24"/>
+        </w:rPr>
+        <w:t xml:space="preserve">A transição do SQLite para a API será incremental, feature por feature: cada recurso migra da implementação local para a implementação REST, validado de ponta a ponta, e só então a API passa a ser a fonte de verdade daquela feature. Não haverá, nesta etapa, migração automática dos registros SQLite existentes, nem offline-first, sincronização ou cache distribuído; essas capacidades poderão ser avaliadas apenas posteriormente.</w:t>
       </w:r>
     </w:p>
     <w:p>
@@ -16319,7 +16227,7 @@
           <w:i/>
           <w:sz w:val="20"/>
         </w:rPr>
-        <w:t>Não implementado ainda.</w:t>
+        <w:t xml:space="preserve">Não implementado ainda. </w:t>
       </w:r>
       <w:r>
         <w:rPr>
@@ -16328,22 +16236,7 @@
           <w:i/>
           <w:sz w:val="20"/>
         </w:rPr>
-        <w:t xml:space="preserve"> Esta subseção é apenas planejamento de evolução</w:t>
-      </w:r>
-    </w:p>
-    <w:p>
-      <w:pPr>
-        <w:pStyle w:val="EditorialStatus"/>
-        <w:rPr/>
-      </w:pPr>
-      <w:r>
-        <w:rPr>
-          <w:rFonts w:eastAsia="Times New Roman"/>
-          <w:b w:val="false"/>
-          <w:i/>
-          <w:sz w:val="20"/>
-        </w:rPr>
-        <w:t>arquitetural e não deve ser lida como descrição do estado atual.</w:t>
+        <w:t xml:space="preserve">Esta subseção registra uma arquitetura aprovada e planejada, e não deve ser lida como descrição do estado atual nem como resultado de implementação. O fluxo DSS (POST /api/v1/risk-estimate) permanece inalterado: stateless, sem autenticação e sem persistência operacional.</w:t>
       </w:r>
     </w:p>
     <w:p>
@@ -20002,6 +19895,24 @@
           <w:sz w:val="24"/>
         </w:rPr>
         <w:t>Entre as limitações, destacam-se: uso de dados sintéticos (sem validade externa), ausência de validação clínica, recall zero no limiar 0,5, autenticação ainda não funcional, e a ausência de relacionamentos formais na persistência local (modelo implicitamente monousuário).</w:t>
+      </w:r>
+    </w:p>
+    <w:p>
+      <w:pPr>
+        <w:pStyle w:val="Normal"/>
+        <w:spacing w:lineRule="auto" w:line="360" w:before="0" w:after="0"/>
+        <w:ind w:firstLine="709"/>
+        <w:jc w:val="both"/>
+        <w:rPr/>
+      </w:pPr>
+      <w:r>
+        <w:rPr>
+          <w:rFonts w:eastAsia="Times New Roman"/>
+          <w:b w:val="false"/>
+          <w:i w:val="false"/>
+          <w:sz w:val="24"/>
+        </w:rPr>
+        <w:t xml:space="preserve">O problema da descontinuidade do pré-natal não foi resolvido; este trabalho estabeleceu, antes, uma base metodológica e tecnológica experimental que poderá ser estendida a dados reais. Como trabalhos futuros, indicam-se: a operacionalização longitudinal do desfecho com dados reais (fundamentada e ajustada pela duração gestacional), a implementação da arquitetura de persistência e autenticação aprovada (seção 4.7, ainda não implementada), e a condução de estudos com dados reais sob os devidos requisitos éticos e de consentimento.</w:t>
       </w:r>
     </w:p>
     <w:p>

</xml_diff>

<commit_message>
docs: update TCC2 with persistence infrastructure
</commit_message>
<xml_diff>
--- a/docs/TCC2_MESTRE_Harliton_Martins.docx
+++ b/docs/TCC2_MESTRE_Harliton_Martins.docx
@@ -12919,7 +12919,10 @@
           <w:i w:val="false"/>
           <w:sz w:val="24"/>
         </w:rPr>
-        <w:t xml:space="preserve"> (seções 5.1 e 6.9).</w:t>
+        <w:t xml:space="preserve"> (seções 4.1 e 5.9).</w:t>
+      </w:r>
+      <w:r>
+        <w:t xml:space="preserve"> Adicionalmente, a infraestrutura de persistência do backend foi submetida a um procedimento de validação técnica próprio, contra PostgreSQL real, cobrindo conexão, sessão, transação, rollback e encerramento de recursos (detalhado em 5.9).</w:t>
       </w:r>
     </w:p>
     <w:p>
@@ -14128,6 +14131,261 @@
       </w:r>
     </w:p>
     <w:p>
+      <w:pPr/>
+      <w:r>
+        <w:t>O backend conta, adicionalmente, com uma infraestrutura de persistência já implementada e validada, ainda que não utilizada pelo módulo de acompanhamento — que permanece em SQLite local (seção 4.4). Essa infraestrutura organiza o acesso ao banco de dados relacional em uma camada própria da API, com ciclo de vida centralizado (criação no início e encerramento no fim da aplicação):</w:t>
+      </w:r>
+    </w:p>
+    <w:p>
+      <w:pPr>
+        <w:pStyle w:val="CodeBlock"/>
+      </w:pPr>
+      <w:r>
+        <w:t>FastAPI</w:t>
+        <w:br/>
+        <w:t>├── Fluxo DSS atual (implementado):</w:t>
+        <w:br/>
+        <w:t>│     POST /api/v1/risk-estimate (stateless)</w:t>
+        <w:br/>
+        <w:t>│     → meu_bebe_ml (pipeline congelado)</w:t>
+        <w:br/>
+        <w:t>│     → RandomForestClassifier → predict_proba</w:t>
+        <w:br/>
+        <w:t>│     → probability (classe positiva)</w:t>
+        <w:br/>
+        <w:t>└── Infraestrutura persistente (implementada e validada):</w:t>
+        <w:br/>
+        <w:t xml:space="preserve">      SQLAlchemy 2.x (síncrono) → psycopg 3 → PostgreSQL 16</w:t>
+        <w:br/>
+        <w:t xml:space="preserve">      Alembic (migrações; zero revisions de domínio)</w:t>
+      </w:r>
+    </w:p>
+    <w:p>
+      <w:pPr/>
+      <w:r>
+        <w:t>O ramo superior representa o fluxo DSS atual, já operacional e independente de banco de dados. O ramo inferior representa a infraestrutura de persistência disponível — e, nesta etapa, ainda não conectada a entidades de acompanhamento: não há tabelas de domínio, nem persistência de consultas, exames, vacinas, medicamentos, gestações ou planos de parto. Essa infraestrutura emprega os seguintes componentes:</w:t>
+      </w:r>
+    </w:p>
+    <w:tbl>
+      <w:tblPr>
+        <w:tblStyle w:val="TableGrid"/>
+        <w:tblW w:type="auto" w:w="0"/>
+        <w:tblLook w:firstColumn="1" w:firstRow="1" w:lastColumn="0" w:lastRow="0" w:noHBand="0" w:noVBand="1" w:val="04A0"/>
+      </w:tblPr>
+      <w:tblGrid>
+        <w:gridCol w:w="3024"/>
+        <w:gridCol w:w="3024"/>
+        <w:gridCol w:w="3024"/>
+      </w:tblGrid>
+      <w:tr>
+        <w:tc>
+          <w:tcPr>
+            <w:tcW w:type="dxa" w:w="3024"/>
+          </w:tcPr>
+          <w:p>
+            <w:r>
+              <w:rPr>
+                <w:b/>
+              </w:rPr>
+              <w:t>Componente</w:t>
+            </w:r>
+          </w:p>
+        </w:tc>
+        <w:tc>
+          <w:tcPr>
+            <w:tcW w:type="dxa" w:w="3024"/>
+          </w:tcPr>
+          <w:p>
+            <w:r>
+              <w:rPr>
+                <w:b/>
+              </w:rPr>
+              <w:t>Tecnologia</w:t>
+            </w:r>
+          </w:p>
+        </w:tc>
+        <w:tc>
+          <w:tcPr>
+            <w:tcW w:type="dxa" w:w="3024"/>
+          </w:tcPr>
+          <w:p>
+            <w:r>
+              <w:rPr>
+                <w:b/>
+              </w:rPr>
+              <w:t>Função</w:t>
+            </w:r>
+          </w:p>
+        </w:tc>
+      </w:tr>
+      <w:tr>
+        <w:tc>
+          <w:tcPr>
+            <w:tcW w:type="dxa" w:w="3024"/>
+          </w:tcPr>
+          <w:p>
+            <w:r>
+              <w:t>API</w:t>
+            </w:r>
+          </w:p>
+        </w:tc>
+        <w:tc>
+          <w:tcPr>
+            <w:tcW w:type="dxa" w:w="3024"/>
+          </w:tcPr>
+          <w:p>
+            <w:r>
+              <w:t>FastAPI</w:t>
+            </w:r>
+          </w:p>
+        </w:tc>
+        <w:tc>
+          <w:tcPr>
+            <w:tcW w:type="dxa" w:w="3024"/>
+          </w:tcPr>
+          <w:p>
+            <w:r>
+              <w:t>comunicação HTTP e orquestração dos endpoints</w:t>
+            </w:r>
+          </w:p>
+        </w:tc>
+      </w:tr>
+      <w:tr>
+        <w:tc>
+          <w:tcPr>
+            <w:tcW w:type="dxa" w:w="3024"/>
+          </w:tcPr>
+          <w:p>
+            <w:r>
+              <w:t>ORM</w:t>
+            </w:r>
+          </w:p>
+        </w:tc>
+        <w:tc>
+          <w:tcPr>
+            <w:tcW w:type="dxa" w:w="3024"/>
+          </w:tcPr>
+          <w:p>
+            <w:r>
+              <w:t>SQLAlchemy 2.x</w:t>
+            </w:r>
+          </w:p>
+        </w:tc>
+        <w:tc>
+          <w:tcPr>
+            <w:tcW w:type="dxa" w:w="3024"/>
+          </w:tcPr>
+          <w:p>
+            <w:r>
+              <w:t>acesso estruturado aos dados, em modo síncrono</w:t>
+            </w:r>
+          </w:p>
+        </w:tc>
+      </w:tr>
+      <w:tr>
+        <w:tc>
+          <w:tcPr>
+            <w:tcW w:type="dxa" w:w="3024"/>
+          </w:tcPr>
+          <w:p>
+            <w:r>
+              <w:t>Driver</w:t>
+            </w:r>
+          </w:p>
+        </w:tc>
+        <w:tc>
+          <w:tcPr>
+            <w:tcW w:type="dxa" w:w="3024"/>
+          </w:tcPr>
+          <w:p>
+            <w:r>
+              <w:t>psycopg 3</w:t>
+            </w:r>
+          </w:p>
+        </w:tc>
+        <w:tc>
+          <w:tcPr>
+            <w:tcW w:type="dxa" w:w="3024"/>
+          </w:tcPr>
+          <w:p>
+            <w:r>
+              <w:t>comunicação entre o ORM e o banco</w:t>
+            </w:r>
+          </w:p>
+        </w:tc>
+      </w:tr>
+      <w:tr>
+        <w:tc>
+          <w:tcPr>
+            <w:tcW w:type="dxa" w:w="3024"/>
+          </w:tcPr>
+          <w:p>
+            <w:r>
+              <w:t>Banco</w:t>
+            </w:r>
+          </w:p>
+        </w:tc>
+        <w:tc>
+          <w:tcPr>
+            <w:tcW w:type="dxa" w:w="3024"/>
+          </w:tcPr>
+          <w:p>
+            <w:r>
+              <w:t>PostgreSQL 16</w:t>
+            </w:r>
+          </w:p>
+        </w:tc>
+        <w:tc>
+          <w:tcPr>
+            <w:tcW w:type="dxa" w:w="3024"/>
+          </w:tcPr>
+          <w:p>
+            <w:r>
+              <w:t>banco relacional da persistência futura</w:t>
+            </w:r>
+          </w:p>
+        </w:tc>
+      </w:tr>
+      <w:tr>
+        <w:tc>
+          <w:tcPr>
+            <w:tcW w:type="dxa" w:w="3024"/>
+          </w:tcPr>
+          <w:p>
+            <w:r>
+              <w:t>Migrações</w:t>
+            </w:r>
+          </w:p>
+        </w:tc>
+        <w:tc>
+          <w:tcPr>
+            <w:tcW w:type="dxa" w:w="3024"/>
+          </w:tcPr>
+          <w:p>
+            <w:r>
+              <w:t>Alembic</w:t>
+            </w:r>
+          </w:p>
+        </w:tc>
+        <w:tc>
+          <w:tcPr>
+            <w:tcW w:type="dxa" w:w="3024"/>
+          </w:tcPr>
+          <w:p>
+            <w:r>
+              <w:t>controle versionado da evolução do esquema</w:t>
+            </w:r>
+          </w:p>
+        </w:tc>
+      </w:tr>
+    </w:tbl>
+    <w:p>
+      <w:pPr/>
+      <w:r>
+        <w:t>Fonte: elaboração própria (2026).</w:t>
+      </w:r>
+    </w:p>
+    <w:p>
       <w:pPr>
         <w:pStyle w:val="Normal"/>
         <w:spacing w:lineRule="auto" w:line="360" w:before="0" w:after="0"/>
@@ -14136,13 +14394,7 @@
         <w:rPr/>
       </w:pPr>
       <w:r>
-        <w:rPr>
-          <w:rFonts w:eastAsia="Times New Roman"/>
-          <w:b w:val="false"/>
-          <w:i w:val="false"/>
-          <w:sz w:val="24"/>
-        </w:rPr>
-        <w:t xml:space="preserve">A arquitetura aqui descrita corresponde ao estado implementado. Distingue-se, portanto, a API DSS atual (que recebe a estimativa experimental, stateless) de uma futura API CRUD do acompanhamento pré-natal, prevista na arquitetura aprovada (seção 4.7) e ainda não implementada.</w:t>
+        <w:t>A arquitetura aqui descrita corresponde ao estado implementado — incluindo a infraestrutura de persistência do backend, pronta para receber as entidades de domínio em fases posteriores. Distingue-se, portanto, a API DSS atual (que recebe a estimativa experimental, de forma stateless) da futura API CRUD do acompanhamento pré-natal — cuja infraestrutura de persistência já existe, mas cujas entidades, autenticação e operações CRUD permanecem ainda não implementadas (seção 4.7).</w:t>
       </w:r>
     </w:p>
     <w:p>
@@ -15514,6 +15766,12 @@
           <w:sz w:val="24"/>
         </w:rPr>
         <w:t xml:space="preserve">A estratégia de evolução aprovada para a persistência do acompanhamento prevê que a API/backend passe a ser a fonte de verdade, substituindo progressivamente a dependência do SQLite local. A transição será feature por feature: cada recurso migra da implementação local para uma implementação REST, validada de ponta a ponta, e só então a API passa a ser a fonte de verdade daquela feature. Não haverá, nesta etapa, migração automática dos registros SQLite existentes, nem offline-first, sincronização ou cache distribuído (seção 4.7).</w:t>
+      </w:r>
+    </w:p>
+    <w:p>
+      <w:pPr/>
+      <w:r>
+        <w:t>A infraestrutura de persistência do backend — PostgreSQL 16, SQLAlchemy 2.x (síncrono) e Alembic — já foi implementada e validada (seções 4.1 e 5.9). Ainda assim, o SQLite continua sendo o estado atual da persistência no aplicativo: a troca por essa infraestrutura permanece planejada para etapas posteriores, feature por feature, por meio da API.</w:t>
       </w:r>
     </w:p>
     <w:p>
@@ -16170,13 +16428,7 @@
         <w:rPr/>
       </w:pPr>
       <w:r>
-        <w:rPr>
-          <w:rFonts w:eastAsia="Times New Roman"/>
-          <w:b w:val="false"/>
-          <w:i w:val="false"/>
-          <w:sz w:val="24"/>
-        </w:rPr>
-        <w:t xml:space="preserve">A persistência futura aprovada prevê PostgreSQL como banco, SQLAlchemy 2.x como camada ORM e Alembic para migrações versionadas, com integridade referencial formal (chaves estrangeiras), timestamps e identificadores UUID v4 para as novas entidades persistentes. O modo de acesso do ORM (síncrono ou assíncrono) ainda não está definido e será avaliado na etapa de infraestrutura. O CPF, quando utilizado, pertence ao perfil da gestante e não é chave primária nem credencial de login automática.</w:t>
+        <w:t>A persistência futura aprovada prevê PostgreSQL como banco, SQLAlchemy 2.x como camada ORM e Alembic para migrações versionadas, com integridade referencial formal (chaves estrangeiras), timestamps e identificadores UUID v4 para as novas entidades persistentes. A infraestrutura de persistência correspondente já foi implementada e validada — PostgreSQL 16, SQLAlchemy 2.x em modo síncrono e Alembic configurado (seções 4.1 e 5.9); permanecem futuras a criação das entidades de domínio, as migrations de domínio, a autenticação e o CRUD do acompanhamento. A adoção do modo síncrono decorreu da adequação às características desta solução — endpoints síncronos, ausência de demanda concreta por I/O concorrente intenso, menor complexidade de implementação e maior simplicidade em transações, testes e manutenção — sem que isso constitua juízo de que a abordagem assíncrona seja inferior em geral. O CPF, quando utilizado, pertence ao perfil da gestante e não é chave primária nem credencial de login automática.</w:t>
       </w:r>
     </w:p>
     <w:p>
@@ -18902,6 +19154,12 @@
       </w:r>
     </w:p>
     <w:p>
+      <w:pPr/>
+      <w:r>
+        <w:t>Além disso, a infraestrutura de persistência do backend foi validada contra PostgreSQL real (bancos locais meu_bebe e meu_bebe_test). Foram verificados: a abertura de conexão; o teste de conectividade (SELECT 1); a criação e o encerramento de sessões do SQLAlchemy; a execução de transação e o respectivo rollback; o acesso do Alembic ao banco (com zero revisions de domínio); a ausência de tabelas residuais; e o descarte explícito do engine no encerramento da aplicação. A suíte de testes da API encerrou com 202 testes aprovados e nenhum pulado. Reitera-se que esses testes validam a infraestrutura de software, e não a validade clínica do modelo de ML.</w:t>
+      </w:r>
+    </w:p>
+    <w:p>
       <w:pPr>
         <w:pStyle w:val="Heading2"/>
         <w:ind w:hanging="0"/>
@@ -19768,7 +20026,10 @@
           <w:i w:val="false"/>
           <w:sz w:val="24"/>
         </w:rPr>
-        <w:t xml:space="preserve"> Flutter ↔ FastAPI ↔ IA, validada de ponta a ponta.</w:t>
+        <w:t xml:space="preserve"> Flutter ↔ FastAPI ↔ IA, validada de ponta a ponta</w:t>
+      </w:r>
+      <w:r>
+        <w:t>; e a infraestrutura de persistência do backend (PostgreSQL 16, SQLAlchemy 2.x e Alembic), implementada e validada.</w:t>
       </w:r>
     </w:p>
     <w:p>
@@ -19906,30 +20167,13 @@
         <w:rPr/>
       </w:pPr>
       <w:r>
-        <w:rPr>
-          <w:rFonts w:eastAsia="Times New Roman"/>
-          <w:b w:val="false"/>
-          <w:i w:val="false"/>
-          <w:sz w:val="24"/>
-        </w:rPr>
-        <w:t xml:space="preserve">O problema da descontinuidade do pré-natal não foi resolvido; este trabalho estabeleceu, antes, uma base metodológica e tecnológica experimental que poderá ser estendida a dados reais. Como trabalhos futuros, indicam-se: a operacionalização longitudinal do desfecho com dados reais (fundamentada e ajustada pela duração gestacional), a implementação da arquitetura de persistência e autenticação aprovada (seção 4.7, ainda não implementada), e a condução de estudos com dados reais sob os devidos requisitos éticos e de consentimento.</w:t>
-      </w:r>
-    </w:p>
-    <w:p>
-      <w:pPr>
-        <w:pStyle w:val="Normal"/>
-        <w:rPr/>
-      </w:pPr>
-      <w:r>
-        <w:rPr/>
-      </w:r>
-      <w:r>
-        <w:br w:type="page"/>
+        <w:t>O problema da descontinuidade do pré-natal não foi resolvido; este trabalho estabeleceu, antes, uma base metodológica e tecnológica experimental que poderá ser estendida a dados reais. Como trabalhos futuros, indicam-se: a operacionalização longitudinal do desfecho com dados reais (fundamentada e ajustada pela duração gestacional); a implementação das entidades de domínio, da autenticação e do CRUD do acompanhamento pré-natal (seção 4.7) — cuja infraestrutura de persistência já foi implementada e validada; e a condução de estudos com dados reais sob os devidos requisitos éticos e de consentimento.</w:t>
       </w:r>
     </w:p>
     <w:p>
       <w:pPr>
         <w:pStyle w:val="Heading1"/>
+        <w:pageBreakBefore/>
         <w:spacing w:before="0" w:after="240"/>
         <w:ind w:hanging="0"/>
         <w:jc w:val="start"/>

</xml_diff>

<commit_message>
docs: finalize TCC2 editorial corrections
</commit_message>
<xml_diff>
--- a/docs/TCC2_MESTRE_Harliton_Martins.docx
+++ b/docs/TCC2_MESTRE_Harliton_Martins.docx
@@ -758,6 +758,46 @@
           <w:sz w:val="24"/>
         </w:rPr>
         <w:t>Tabela 4 – Cobertura do IV-DSS no dataset sintético</w:t>
+      </w:r>
+    </w:p>
+    <w:p>
+      <w:pPr>
+        <w:pStyle w:val="Normal"/>
+        <w:jc w:val="center"/>
+      </w:pPr>
+      <w:r>
+        <w:rPr>
+          <w:b/>
+          <w:sz w:val="24"/>
+          <w:szCs w:val="24"/>
+        </w:rPr>
+        <w:t xml:space="preserve">LISTA DE QUADROS</w:t>
+      </w:r>
+    </w:p>
+    <w:p>
+      <w:pPr>
+        <w:pStyle w:val="Normal"/>
+        <w:jc w:val="both"/>
+      </w:pPr>
+      <w:r>
+        <w:rPr>
+          <w:sz w:val="24"/>
+          <w:szCs w:val="24"/>
+        </w:rPr>
+        <w:t xml:space="preserve">Quadro 1 – Classificação consolidada das 48 variáveis do questionário</w:t>
+      </w:r>
+    </w:p>
+    <w:p>
+      <w:pPr>
+        <w:pStyle w:val="Normal"/>
+        <w:jc w:val="both"/>
+      </w:pPr>
+      <w:r>
+        <w:rPr>
+          <w:sz w:val="24"/>
+          <w:szCs w:val="24"/>
+        </w:rPr>
+        <w:t xml:space="preserve">Quadro 2 – Componentes tecnológicos da infraestrutura de persistência do backend</w:t>
       </w:r>
     </w:p>
     <w:p>
@@ -831,15 +871,11 @@
             </w:pPr>
             <w:r>
               <w:rPr>
-                <w:rFonts w:eastAsia="Times New Roman" w:cs=""/>
                 <w:b/>
-                <w:i w:val="false"/>
-                <w:kern w:val="0"/>
                 <w:sz w:val="20"/>
-                <w:szCs w:val="22"/>
-                <w:lang w:val="en-US" w:eastAsia="en-US" w:bidi="ar-SA"/>
+                <w:szCs w:val="20"/>
               </w:rPr>
-              <w:t>API</w:t>
+              <w:t xml:space="preserve">API</w:t>
             </w:r>
           </w:p>
         </w:tc>
@@ -863,15 +899,10 @@
             </w:pPr>
             <w:r>
               <w:rPr>
-                <w:rFonts w:eastAsia="Times New Roman" w:cs=""/>
-                <w:b w:val="false"/>
-                <w:i w:val="false"/>
-                <w:kern w:val="0"/>
                 <w:sz w:val="20"/>
-                <w:szCs w:val="22"/>
-                <w:lang w:val="en-US" w:eastAsia="en-US" w:bidi="ar-SA"/>
+                <w:szCs w:val="20"/>
               </w:rPr>
-              <w:t>Application Programming Interface</w:t>
+              <w:t xml:space="preserve">Application Programming Interface</w:t>
             </w:r>
           </w:p>
         </w:tc>
@@ -898,15 +929,11 @@
             </w:pPr>
             <w:r>
               <w:rPr>
-                <w:rFonts w:eastAsia="Times New Roman" w:cs=""/>
                 <w:b/>
-                <w:i w:val="false"/>
-                <w:kern w:val="0"/>
                 <w:sz w:val="20"/>
-                <w:szCs w:val="22"/>
-                <w:lang w:val="en-US" w:eastAsia="en-US" w:bidi="ar-SA"/>
+                <w:szCs w:val="20"/>
               </w:rPr>
-              <w:t>CV</w:t>
+              <w:t xml:space="preserve">CRUD</w:t>
             </w:r>
           </w:p>
         </w:tc>
@@ -930,15 +957,10 @@
             </w:pPr>
             <w:r>
               <w:rPr>
-                <w:rFonts w:eastAsia="Times New Roman" w:cs=""/>
-                <w:b w:val="false"/>
-                <w:i w:val="false"/>
-                <w:kern w:val="0"/>
                 <w:sz w:val="20"/>
-                <w:szCs w:val="22"/>
-                <w:lang w:val="en-US" w:eastAsia="en-US" w:bidi="ar-SA"/>
+                <w:szCs w:val="20"/>
               </w:rPr>
-              <w:t>Validação cruzada (cross-validation)</w:t>
+              <w:t xml:space="preserve">Create, Read, Update, Delete</w:t>
             </w:r>
           </w:p>
         </w:tc>
@@ -965,15 +987,11 @@
             </w:pPr>
             <w:r>
               <w:rPr>
-                <w:rFonts w:eastAsia="Times New Roman" w:cs=""/>
                 <w:b/>
-                <w:i w:val="false"/>
-                <w:kern w:val="0"/>
                 <w:sz w:val="20"/>
-                <w:szCs w:val="22"/>
-                <w:lang w:val="en-US" w:eastAsia="en-US" w:bidi="ar-SA"/>
+                <w:szCs w:val="20"/>
               </w:rPr>
-              <w:t>DGM</w:t>
+              <w:t xml:space="preserve">CV</w:t>
             </w:r>
           </w:p>
         </w:tc>
@@ -997,15 +1015,10 @@
             </w:pPr>
             <w:r>
               <w:rPr>
-                <w:rFonts w:eastAsia="Times New Roman" w:cs=""/>
-                <w:b w:val="false"/>
-                <w:i w:val="false"/>
-                <w:kern w:val="0"/>
                 <w:sz w:val="20"/>
-                <w:szCs w:val="22"/>
-                <w:lang w:val="en-US" w:eastAsia="en-US" w:bidi="ar-SA"/>
+                <w:szCs w:val="20"/>
               </w:rPr>
-              <w:t>Data Generation Model</w:t>
+              <w:t xml:space="preserve">Validação cruzada (cross-validation)</w:t>
             </w:r>
           </w:p>
         </w:tc>
@@ -1032,15 +1045,11 @@
             </w:pPr>
             <w:r>
               <w:rPr>
-                <w:rFonts w:eastAsia="Times New Roman" w:cs=""/>
                 <w:b/>
-                <w:i w:val="false"/>
-                <w:kern w:val="0"/>
                 <w:sz w:val="20"/>
-                <w:szCs w:val="22"/>
-                <w:lang w:val="en-US" w:eastAsia="en-US" w:bidi="ar-SA"/>
+                <w:szCs w:val="20"/>
               </w:rPr>
-              <w:t>DSS</w:t>
+              <w:t xml:space="preserve">DGM</w:t>
             </w:r>
           </w:p>
         </w:tc>
@@ -1064,15 +1073,10 @@
             </w:pPr>
             <w:r>
               <w:rPr>
-                <w:rFonts w:eastAsia="Times New Roman" w:cs=""/>
-                <w:b w:val="false"/>
-                <w:i w:val="false"/>
-                <w:kern w:val="0"/>
                 <w:sz w:val="20"/>
-                <w:szCs w:val="22"/>
-                <w:lang w:val="en-US" w:eastAsia="en-US" w:bidi="ar-SA"/>
+                <w:szCs w:val="20"/>
               </w:rPr>
-              <w:t>Determinantes Sociais da Saúde</w:t>
+              <w:t xml:space="preserve">Data Generation Model</w:t>
             </w:r>
           </w:p>
         </w:tc>
@@ -1099,15 +1103,11 @@
             </w:pPr>
             <w:r>
               <w:rPr>
-                <w:rFonts w:eastAsia="Times New Roman" w:cs=""/>
                 <w:b/>
-                <w:i w:val="false"/>
-                <w:kern w:val="0"/>
                 <w:sz w:val="20"/>
-                <w:szCs w:val="22"/>
-                <w:lang w:val="en-US" w:eastAsia="en-US" w:bidi="ar-SA"/>
+                <w:szCs w:val="20"/>
               </w:rPr>
-              <w:t>IV-DSS</w:t>
+              <w:t xml:space="preserve">DPP</w:t>
             </w:r>
           </w:p>
         </w:tc>
@@ -1131,15 +1131,10 @@
             </w:pPr>
             <w:r>
               <w:rPr>
-                <w:rFonts w:eastAsia="Times New Roman" w:cs=""/>
-                <w:b w:val="false"/>
-                <w:i w:val="false"/>
-                <w:kern w:val="0"/>
                 <w:sz w:val="20"/>
-                <w:szCs w:val="22"/>
-                <w:lang w:val="en-US" w:eastAsia="en-US" w:bidi="ar-SA"/>
+                <w:szCs w:val="20"/>
               </w:rPr>
-              <w:t>Índice de Vulnerabilidade dos Determinantes Sociais da Saúde</w:t>
+              <w:t xml:space="preserve">Data provável do parto</w:t>
             </w:r>
           </w:p>
         </w:tc>
@@ -1166,15 +1161,11 @@
             </w:pPr>
             <w:r>
               <w:rPr>
-                <w:rFonts w:eastAsia="Times New Roman" w:cs=""/>
                 <w:b/>
-                <w:i w:val="false"/>
-                <w:kern w:val="0"/>
                 <w:sz w:val="20"/>
-                <w:szCs w:val="22"/>
-                <w:lang w:val="en-US" w:eastAsia="en-US" w:bidi="ar-SA"/>
+                <w:szCs w:val="20"/>
               </w:rPr>
-              <w:t>ML</w:t>
+              <w:t xml:space="preserve">DSS</w:t>
             </w:r>
           </w:p>
         </w:tc>
@@ -1198,15 +1189,10 @@
             </w:pPr>
             <w:r>
               <w:rPr>
-                <w:rFonts w:eastAsia="Times New Roman" w:cs=""/>
-                <w:b w:val="false"/>
-                <w:i w:val="false"/>
-                <w:kern w:val="0"/>
                 <w:sz w:val="20"/>
-                <w:szCs w:val="22"/>
-                <w:lang w:val="en-US" w:eastAsia="en-US" w:bidi="ar-SA"/>
+                <w:szCs w:val="20"/>
               </w:rPr>
-              <w:t>Aprendizado de máquina (machine learning)</w:t>
+              <w:t xml:space="preserve">Determinantes Sociais da Saúde</w:t>
             </w:r>
           </w:p>
         </w:tc>
@@ -1233,15 +1219,11 @@
             </w:pPr>
             <w:r>
               <w:rPr>
-                <w:rFonts w:eastAsia="Times New Roman" w:cs=""/>
                 <w:b/>
-                <w:i w:val="false"/>
-                <w:kern w:val="0"/>
                 <w:sz w:val="20"/>
-                <w:szCs w:val="22"/>
-                <w:lang w:val="en-US" w:eastAsia="en-US" w:bidi="ar-SA"/>
+                <w:szCs w:val="20"/>
               </w:rPr>
-              <w:t>OMS</w:t>
+              <w:t xml:space="preserve">EBIA</w:t>
             </w:r>
           </w:p>
         </w:tc>
@@ -1265,15 +1247,10 @@
             </w:pPr>
             <w:r>
               <w:rPr>
-                <w:rFonts w:eastAsia="Times New Roman" w:cs=""/>
-                <w:b w:val="false"/>
-                <w:i w:val="false"/>
-                <w:kern w:val="0"/>
                 <w:sz w:val="20"/>
-                <w:szCs w:val="22"/>
-                <w:lang w:val="en-US" w:eastAsia="en-US" w:bidi="ar-SA"/>
+                <w:szCs w:val="20"/>
               </w:rPr>
-              <w:t>Organização Mundial da Saúde</w:t>
+              <w:t xml:space="preserve">Escala Brasileira de Insegurança Alimentar</w:t>
             </w:r>
           </w:p>
         </w:tc>
@@ -1300,15 +1277,11 @@
             </w:pPr>
             <w:r>
               <w:rPr>
-                <w:rFonts w:eastAsia="Times New Roman" w:cs=""/>
                 <w:b/>
-                <w:i w:val="false"/>
-                <w:kern w:val="0"/>
                 <w:sz w:val="20"/>
-                <w:szCs w:val="22"/>
-                <w:lang w:val="en-US" w:eastAsia="en-US" w:bidi="ar-SA"/>
+                <w:szCs w:val="20"/>
               </w:rPr>
-              <w:t>PR-AUC</w:t>
+              <w:t xml:space="preserve">FIES</w:t>
             </w:r>
           </w:p>
         </w:tc>
@@ -1332,15 +1305,10 @@
             </w:pPr>
             <w:r>
               <w:rPr>
-                <w:rFonts w:eastAsia="Times New Roman" w:cs=""/>
-                <w:b w:val="false"/>
-                <w:i w:val="false"/>
-                <w:kern w:val="0"/>
                 <w:sz w:val="20"/>
-                <w:szCs w:val="22"/>
-                <w:lang w:val="en-US" w:eastAsia="en-US" w:bidi="ar-SA"/>
+                <w:szCs w:val="20"/>
               </w:rPr>
-              <w:t>Área sob a curva Precision-Recall</w:t>
+              <w:t xml:space="preserve">Food Insecurity Experience Scale</w:t>
             </w:r>
           </w:p>
         </w:tc>
@@ -1367,15 +1335,11 @@
             </w:pPr>
             <w:r>
               <w:rPr>
-                <w:rFonts w:eastAsia="Times New Roman" w:cs=""/>
                 <w:b/>
-                <w:i w:val="false"/>
-                <w:kern w:val="0"/>
                 <w:sz w:val="20"/>
-                <w:szCs w:val="22"/>
-                <w:lang w:val="en-US" w:eastAsia="en-US" w:bidi="ar-SA"/>
+                <w:szCs w:val="20"/>
               </w:rPr>
-              <w:t>RF</w:t>
+              <w:t xml:space="preserve">IG</w:t>
             </w:r>
           </w:p>
         </w:tc>
@@ -1399,15 +1363,10 @@
             </w:pPr>
             <w:r>
               <w:rPr>
-                <w:rFonts w:eastAsia="Times New Roman" w:cs=""/>
-                <w:b w:val="false"/>
-                <w:i w:val="false"/>
-                <w:kern w:val="0"/>
                 <w:sz w:val="20"/>
-                <w:szCs w:val="22"/>
-                <w:lang w:val="en-US" w:eastAsia="en-US" w:bidi="ar-SA"/>
+                <w:szCs w:val="20"/>
               </w:rPr>
-              <w:t>Random Forest</w:t>
+              <w:t xml:space="preserve">Idade gestacional</w:t>
             </w:r>
           </w:p>
         </w:tc>
@@ -1434,15 +1393,11 @@
             </w:pPr>
             <w:r>
               <w:rPr>
-                <w:rFonts w:eastAsia="Times New Roman" w:cs=""/>
                 <w:b/>
-                <w:i w:val="false"/>
-                <w:kern w:val="0"/>
                 <w:sz w:val="20"/>
-                <w:szCs w:val="22"/>
-                <w:lang w:val="en-US" w:eastAsia="en-US" w:bidi="ar-SA"/>
+                <w:szCs w:val="20"/>
               </w:rPr>
-              <w:t>RL</w:t>
+              <w:t xml:space="preserve">IV-DSS</w:t>
             </w:r>
           </w:p>
         </w:tc>
@@ -1466,15 +1421,10 @@
             </w:pPr>
             <w:r>
               <w:rPr>
-                <w:rFonts w:eastAsia="Times New Roman" w:cs=""/>
-                <w:b w:val="false"/>
-                <w:i w:val="false"/>
-                <w:kern w:val="0"/>
                 <w:sz w:val="20"/>
-                <w:szCs w:val="22"/>
-                <w:lang w:val="en-US" w:eastAsia="en-US" w:bidi="ar-SA"/>
+                <w:szCs w:val="20"/>
               </w:rPr>
-              <w:t>Regressão logística</w:t>
+              <w:t xml:space="preserve">Índice de Vulnerabilidade dos Determinantes Sociais da Saúde</w:t>
             </w:r>
           </w:p>
         </w:tc>
@@ -1501,15 +1451,11 @@
             </w:pPr>
             <w:r>
               <w:rPr>
-                <w:rFonts w:eastAsia="Times New Roman" w:cs=""/>
                 <w:b/>
-                <w:i w:val="false"/>
-                <w:kern w:val="0"/>
                 <w:sz w:val="20"/>
-                <w:szCs w:val="22"/>
-                <w:lang w:val="en-US" w:eastAsia="en-US" w:bidi="ar-SA"/>
+                <w:szCs w:val="20"/>
               </w:rPr>
-              <w:t>ROC-AUC</w:t>
+              <w:t xml:space="preserve">LGPD</w:t>
             </w:r>
           </w:p>
         </w:tc>
@@ -1533,15 +1479,10 @@
             </w:pPr>
             <w:r>
               <w:rPr>
-                <w:rFonts w:eastAsia="Times New Roman" w:cs=""/>
-                <w:b w:val="false"/>
-                <w:i w:val="false"/>
-                <w:kern w:val="0"/>
                 <w:sz w:val="20"/>
-                <w:szCs w:val="22"/>
-                <w:lang w:val="en-US" w:eastAsia="en-US" w:bidi="ar-SA"/>
+                <w:szCs w:val="20"/>
               </w:rPr>
-              <w:t>Área sob a curva ROC</w:t>
+              <w:t xml:space="preserve">Lei Geral de Proteção de Dados</w:t>
             </w:r>
           </w:p>
         </w:tc>
@@ -1568,15 +1509,11 @@
             </w:pPr>
             <w:r>
               <w:rPr>
-                <w:rFonts w:eastAsia="Times New Roman" w:cs=""/>
                 <w:b/>
-                <w:i w:val="false"/>
-                <w:kern w:val="0"/>
                 <w:sz w:val="20"/>
-                <w:szCs w:val="22"/>
-                <w:lang w:val="en-US" w:eastAsia="en-US" w:bidi="ar-SA"/>
+                <w:szCs w:val="20"/>
               </w:rPr>
-              <w:t>SUS</w:t>
+              <w:t xml:space="preserve">ML</w:t>
             </w:r>
           </w:p>
         </w:tc>
@@ -1600,15 +1537,10 @@
             </w:pPr>
             <w:r>
               <w:rPr>
-                <w:rFonts w:eastAsia="Times New Roman" w:cs=""/>
-                <w:b w:val="false"/>
-                <w:i w:val="false"/>
-                <w:kern w:val="0"/>
                 <w:sz w:val="20"/>
-                <w:szCs w:val="22"/>
-                <w:lang w:val="en-US" w:eastAsia="en-US" w:bidi="ar-SA"/>
+                <w:szCs w:val="20"/>
               </w:rPr>
-              <w:t>Sistema Único de Saúde</w:t>
+              <w:t xml:space="preserve">Aprendizado de máquina (machine learning)</w:t>
             </w:r>
           </w:p>
         </w:tc>
@@ -1635,15 +1567,11 @@
             </w:pPr>
             <w:r>
               <w:rPr>
-                <w:rFonts w:eastAsia="Times New Roman" w:cs=""/>
                 <w:b/>
-                <w:i w:val="false"/>
-                <w:kern w:val="0"/>
                 <w:sz w:val="20"/>
-                <w:szCs w:val="22"/>
-                <w:lang w:val="en-US" w:eastAsia="en-US" w:bidi="ar-SA"/>
+                <w:szCs w:val="20"/>
               </w:rPr>
-              <w:t>T0</w:t>
+              <w:t xml:space="preserve">ORM</w:t>
             </w:r>
           </w:p>
         </w:tc>
@@ -1667,15 +1595,10 @@
             </w:pPr>
             <w:r>
               <w:rPr>
-                <w:rFonts w:eastAsia="Times New Roman" w:cs=""/>
-                <w:b w:val="false"/>
-                <w:i w:val="false"/>
-                <w:kern w:val="0"/>
                 <w:sz w:val="20"/>
-                <w:szCs w:val="22"/>
-                <w:lang w:val="en-US" w:eastAsia="en-US" w:bidi="ar-SA"/>
+                <w:szCs w:val="20"/>
               </w:rPr>
-              <w:t>Instante de aplicação/envio do questionário DSS</w:t>
+              <w:t xml:space="preserve">Object-Relational Mapping</w:t>
             </w:r>
           </w:p>
         </w:tc>
@@ -1702,15 +1625,11 @@
             </w:pPr>
             <w:r>
               <w:rPr>
-                <w:rFonts w:eastAsia="Times New Roman" w:cs=""/>
                 <w:b/>
-                <w:i w:val="false"/>
-                <w:kern w:val="0"/>
                 <w:sz w:val="20"/>
-                <w:szCs w:val="22"/>
-                <w:lang w:val="en-US" w:eastAsia="en-US" w:bidi="ar-SA"/>
+                <w:szCs w:val="20"/>
               </w:rPr>
-              <w:t>UBS</w:t>
+              <w:t xml:space="preserve">PNS</w:t>
             </w:r>
           </w:p>
         </w:tc>
@@ -1734,15 +1653,10 @@
             </w:pPr>
             <w:r>
               <w:rPr>
-                <w:rFonts w:eastAsia="Times New Roman" w:cs=""/>
-                <w:b w:val="false"/>
-                <w:i w:val="false"/>
-                <w:kern w:val="0"/>
                 <w:sz w:val="20"/>
-                <w:szCs w:val="22"/>
-                <w:lang w:val="en-US" w:eastAsia="en-US" w:bidi="ar-SA"/>
+                <w:szCs w:val="20"/>
               </w:rPr>
-              <w:t>Unidade Básica de Saúde</w:t>
+              <w:t xml:space="preserve">Pesquisa Nacional de Saúde</w:t>
             </w:r>
           </w:p>
         </w:tc>
@@ -1769,15 +1683,11 @@
             </w:pPr>
             <w:r>
               <w:rPr>
-                <w:rFonts w:eastAsia="Times New Roman" w:cs=""/>
                 <w:b/>
-                <w:i w:val="false"/>
-                <w:kern w:val="0"/>
                 <w:sz w:val="20"/>
-                <w:szCs w:val="22"/>
-                <w:lang w:val="en-US" w:eastAsia="en-US" w:bidi="ar-SA"/>
+                <w:szCs w:val="20"/>
               </w:rPr>
-              <w:t>XGBoost</w:t>
+              <w:t xml:space="preserve">PR-AUC</w:t>
             </w:r>
           </w:p>
         </w:tc>
@@ -1801,15 +1711,590 @@
             </w:pPr>
             <w:r>
               <w:rPr>
-                <w:rFonts w:eastAsia="Times New Roman" w:cs=""/>
-                <w:b w:val="false"/>
-                <w:i w:val="false"/>
+                <w:sz w:val="20"/>
+                <w:szCs w:val="20"/>
+              </w:rPr>
+              <w:t xml:space="preserve">Área sob a curva Precision-Recall</w:t>
+            </w:r>
+          </w:p>
+        </w:tc>
+      </w:tr>
+      <w:tr>
+        <w:trPr/>
+        <w:tc>
+          <w:tcPr>
+            <w:tcW w:w="4535" w:type="dxa"/>
+            <w:tcBorders/>
+          </w:tcPr>
+          <w:p>
+            <w:pPr>
+              <w:pStyle w:val="Normal"/>
+              <w:widowControl/>
+              <w:spacing w:lineRule="auto" w:line="240" w:before="0" w:after="0"/>
+              <w:jc w:val="start"/>
+              <w:rPr>
+                <w:rFonts w:eastAsia="ＭＳ 明朝" w:cs=""/>
                 <w:kern w:val="0"/>
-                <w:sz w:val="20"/>
                 <w:szCs w:val="22"/>
                 <w:lang w:val="en-US" w:eastAsia="en-US" w:bidi="ar-SA"/>
               </w:rPr>
-              <w:t>Extreme Gradient Boosting</w:t>
+            </w:pPr>
+            <w:r>
+              <w:rPr>
+                <w:b/>
+                <w:sz w:val="20"/>
+                <w:szCs w:val="20"/>
+              </w:rPr>
+              <w:t xml:space="preserve">RF</w:t>
+            </w:r>
+          </w:p>
+        </w:tc>
+        <w:tc>
+          <w:tcPr>
+            <w:tcW w:w="4534" w:type="dxa"/>
+            <w:tcBorders/>
+          </w:tcPr>
+          <w:p>
+            <w:pPr>
+              <w:pStyle w:val="Normal"/>
+              <w:widowControl/>
+              <w:spacing w:lineRule="auto" w:line="240" w:before="0" w:after="0"/>
+              <w:jc w:val="start"/>
+              <w:rPr>
+                <w:rFonts w:eastAsia="ＭＳ 明朝" w:cs=""/>
+                <w:kern w:val="0"/>
+                <w:szCs w:val="22"/>
+                <w:lang w:val="en-US" w:eastAsia="en-US" w:bidi="ar-SA"/>
+              </w:rPr>
+            </w:pPr>
+            <w:r>
+              <w:rPr>
+                <w:sz w:val="20"/>
+                <w:szCs w:val="20"/>
+              </w:rPr>
+              <w:t xml:space="preserve">Random Forest</w:t>
+            </w:r>
+          </w:p>
+        </w:tc>
+      </w:tr>
+      <w:tr>
+        <w:trPr/>
+        <w:tc>
+          <w:tcPr>
+            <w:tcW w:w="4535" w:type="dxa"/>
+            <w:tcBorders/>
+          </w:tcPr>
+          <w:p>
+            <w:pPr>
+              <w:pStyle w:val="Normal"/>
+              <w:widowControl/>
+              <w:spacing w:lineRule="auto" w:line="240" w:before="0" w:after="0"/>
+              <w:jc w:val="start"/>
+              <w:rPr>
+                <w:rFonts w:eastAsia="ＭＳ 明朝" w:cs=""/>
+                <w:kern w:val="0"/>
+                <w:szCs w:val="22"/>
+                <w:lang w:val="en-US" w:eastAsia="en-US" w:bidi="ar-SA"/>
+              </w:rPr>
+            </w:pPr>
+            <w:r>
+              <w:rPr>
+                <w:b/>
+                <w:sz w:val="20"/>
+                <w:szCs w:val="20"/>
+              </w:rPr>
+              <w:t xml:space="preserve">RL</w:t>
+            </w:r>
+          </w:p>
+        </w:tc>
+        <w:tc>
+          <w:tcPr>
+            <w:tcW w:w="4534" w:type="dxa"/>
+            <w:tcBorders/>
+          </w:tcPr>
+          <w:p>
+            <w:pPr>
+              <w:pStyle w:val="Normal"/>
+              <w:widowControl/>
+              <w:spacing w:lineRule="auto" w:line="240" w:before="0" w:after="0"/>
+              <w:jc w:val="start"/>
+              <w:rPr>
+                <w:rFonts w:eastAsia="ＭＳ 明朝" w:cs=""/>
+                <w:kern w:val="0"/>
+                <w:szCs w:val="22"/>
+                <w:lang w:val="en-US" w:eastAsia="en-US" w:bidi="ar-SA"/>
+              </w:rPr>
+            </w:pPr>
+            <w:r>
+              <w:rPr>
+                <w:sz w:val="20"/>
+                <w:szCs w:val="20"/>
+              </w:rPr>
+              <w:t xml:space="preserve">Regressão logística</w:t>
+            </w:r>
+          </w:p>
+        </w:tc>
+      </w:tr>
+      <w:tr>
+        <w:trPr/>
+        <w:tc>
+          <w:tcPr>
+            <w:tcW w:w="4535" w:type="dxa"/>
+            <w:tcBorders/>
+          </w:tcPr>
+          <w:p>
+            <w:pPr>
+              <w:pStyle w:val="Normal"/>
+              <w:widowControl/>
+              <w:spacing w:lineRule="auto" w:line="240" w:before="0" w:after="0"/>
+              <w:jc w:val="start"/>
+              <w:rPr>
+                <w:rFonts w:eastAsia="ＭＳ 明朝" w:cs=""/>
+                <w:kern w:val="0"/>
+                <w:szCs w:val="22"/>
+                <w:lang w:val="en-US" w:eastAsia="en-US" w:bidi="ar-SA"/>
+              </w:rPr>
+            </w:pPr>
+            <w:r>
+              <w:rPr>
+                <w:b/>
+                <w:sz w:val="20"/>
+                <w:szCs w:val="20"/>
+              </w:rPr>
+              <w:t xml:space="preserve">ROC-AUC</w:t>
+            </w:r>
+          </w:p>
+        </w:tc>
+        <w:tc>
+          <w:tcPr>
+            <w:tcW w:w="4534" w:type="dxa"/>
+            <w:tcBorders/>
+          </w:tcPr>
+          <w:p>
+            <w:pPr>
+              <w:pStyle w:val="Normal"/>
+              <w:widowControl/>
+              <w:spacing w:lineRule="auto" w:line="240" w:before="0" w:after="0"/>
+              <w:jc w:val="start"/>
+              <w:rPr>
+                <w:rFonts w:eastAsia="ＭＳ 明朝" w:cs=""/>
+                <w:kern w:val="0"/>
+                <w:szCs w:val="22"/>
+                <w:lang w:val="en-US" w:eastAsia="en-US" w:bidi="ar-SA"/>
+              </w:rPr>
+            </w:pPr>
+            <w:r>
+              <w:rPr>
+                <w:sz w:val="20"/>
+                <w:szCs w:val="20"/>
+              </w:rPr>
+              <w:t xml:space="preserve">Área sob a curva ROC</w:t>
+            </w:r>
+          </w:p>
+        </w:tc>
+      </w:tr>
+      <w:tr>
+        <w:trPr/>
+        <w:tc>
+          <w:tcPr>
+            <w:tcW w:w="4535" w:type="dxa"/>
+            <w:tcBorders/>
+          </w:tcPr>
+          <w:p>
+            <w:pPr>
+              <w:pStyle w:val="Normal"/>
+              <w:widowControl/>
+              <w:spacing w:lineRule="auto" w:line="240" w:before="0" w:after="0"/>
+              <w:jc w:val="start"/>
+              <w:rPr>
+                <w:rFonts w:eastAsia="ＭＳ 明朝" w:cs=""/>
+                <w:kern w:val="0"/>
+                <w:szCs w:val="22"/>
+                <w:lang w:val="en-US" w:eastAsia="en-US" w:bidi="ar-SA"/>
+              </w:rPr>
+            </w:pPr>
+            <w:r>
+              <w:rPr>
+                <w:b/>
+                <w:sz w:val="20"/>
+                <w:szCs w:val="20"/>
+              </w:rPr>
+              <w:t xml:space="preserve">SISPRENATAL</w:t>
+            </w:r>
+          </w:p>
+        </w:tc>
+        <w:tc>
+          <w:tcPr>
+            <w:tcW w:w="4534" w:type="dxa"/>
+            <w:tcBorders/>
+          </w:tcPr>
+          <w:p>
+            <w:pPr>
+              <w:pStyle w:val="Normal"/>
+              <w:widowControl/>
+              <w:spacing w:lineRule="auto" w:line="240" w:before="0" w:after="0"/>
+              <w:jc w:val="start"/>
+              <w:rPr>
+                <w:rFonts w:eastAsia="ＭＳ 明朝" w:cs=""/>
+                <w:kern w:val="0"/>
+                <w:szCs w:val="22"/>
+                <w:lang w:val="en-US" w:eastAsia="en-US" w:bidi="ar-SA"/>
+              </w:rPr>
+            </w:pPr>
+            <w:r>
+              <w:rPr>
+                <w:sz w:val="20"/>
+                <w:szCs w:val="20"/>
+              </w:rPr>
+              <w:t xml:space="preserve">Sistema de Informação do Pré-Natal</w:t>
+            </w:r>
+          </w:p>
+        </w:tc>
+      </w:tr>
+      <w:tr>
+        <w:trPr/>
+        <w:tc>
+          <w:tcPr>
+            <w:tcW w:w="4535" w:type="dxa"/>
+            <w:tcBorders/>
+          </w:tcPr>
+          <w:p>
+            <w:pPr>
+              <w:pStyle w:val="Normal"/>
+              <w:widowControl/>
+              <w:spacing w:lineRule="auto" w:line="240" w:before="0" w:after="0"/>
+              <w:jc w:val="start"/>
+              <w:rPr>
+                <w:rFonts w:eastAsia="ＭＳ 明朝" w:cs=""/>
+                <w:kern w:val="0"/>
+                <w:szCs w:val="22"/>
+                <w:lang w:val="en-US" w:eastAsia="en-US" w:bidi="ar-SA"/>
+              </w:rPr>
+            </w:pPr>
+            <w:r>
+              <w:rPr>
+                <w:b/>
+                <w:sz w:val="20"/>
+                <w:szCs w:val="20"/>
+              </w:rPr>
+              <w:t xml:space="preserve">SUS</w:t>
+            </w:r>
+          </w:p>
+        </w:tc>
+        <w:tc>
+          <w:tcPr>
+            <w:tcW w:w="4534" w:type="dxa"/>
+            <w:tcBorders/>
+          </w:tcPr>
+          <w:p>
+            <w:pPr>
+              <w:pStyle w:val="Normal"/>
+              <w:widowControl/>
+              <w:spacing w:lineRule="auto" w:line="240" w:before="0" w:after="0"/>
+              <w:jc w:val="start"/>
+              <w:rPr>
+                <w:rFonts w:eastAsia="ＭＳ 明朝" w:cs=""/>
+                <w:kern w:val="0"/>
+                <w:szCs w:val="22"/>
+                <w:lang w:val="en-US" w:eastAsia="en-US" w:bidi="ar-SA"/>
+              </w:rPr>
+            </w:pPr>
+            <w:r>
+              <w:rPr>
+                <w:sz w:val="20"/>
+                <w:szCs w:val="20"/>
+              </w:rPr>
+              <w:t xml:space="preserve">Sistema Único de Saúde</w:t>
+            </w:r>
+          </w:p>
+        </w:tc>
+      </w:tr>
+      <w:tr>
+        <w:trPr/>
+        <w:tc>
+          <w:tcPr>
+            <w:tcW w:w="4535" w:type="dxa"/>
+            <w:tcBorders/>
+          </w:tcPr>
+          <w:p>
+            <w:pPr>
+              <w:pStyle w:val="Normal"/>
+              <w:widowControl/>
+              <w:spacing w:lineRule="auto" w:line="240" w:before="0" w:after="0"/>
+              <w:jc w:val="start"/>
+              <w:rPr>
+                <w:rFonts w:eastAsia="ＭＳ 明朝" w:cs=""/>
+                <w:kern w:val="0"/>
+                <w:szCs w:val="22"/>
+                <w:lang w:val="en-US" w:eastAsia="en-US" w:bidi="ar-SA"/>
+              </w:rPr>
+            </w:pPr>
+            <w:r>
+              <w:rPr>
+                <w:b/>
+                <w:sz w:val="20"/>
+                <w:szCs w:val="20"/>
+              </w:rPr>
+              <w:t xml:space="preserve">T0</w:t>
+            </w:r>
+          </w:p>
+        </w:tc>
+        <w:tc>
+          <w:tcPr>
+            <w:tcW w:w="4534" w:type="dxa"/>
+            <w:tcBorders/>
+          </w:tcPr>
+          <w:p>
+            <w:pPr>
+              <w:pStyle w:val="Normal"/>
+              <w:widowControl/>
+              <w:spacing w:lineRule="auto" w:line="240" w:before="0" w:after="0"/>
+              <w:jc w:val="start"/>
+              <w:rPr>
+                <w:rFonts w:eastAsia="ＭＳ 明朝" w:cs=""/>
+                <w:kern w:val="0"/>
+                <w:szCs w:val="22"/>
+                <w:lang w:val="en-US" w:eastAsia="en-US" w:bidi="ar-SA"/>
+              </w:rPr>
+            </w:pPr>
+            <w:r>
+              <w:rPr>
+                <w:sz w:val="20"/>
+                <w:szCs w:val="20"/>
+              </w:rPr>
+              <w:t xml:space="preserve">Instante de aplicação/envio do questionário DSS</w:t>
+            </w:r>
+          </w:p>
+        </w:tc>
+      </w:tr>
+      <w:tr>
+        <w:trPr/>
+        <w:tc>
+          <w:tcPr>
+            <w:tcW w:w="4535" w:type="dxa"/>
+            <w:tcBorders/>
+          </w:tcPr>
+          <w:p>
+            <w:pPr>
+              <w:pStyle w:val="Normal"/>
+              <w:widowControl/>
+              <w:spacing w:lineRule="auto" w:line="240" w:before="0" w:after="0"/>
+              <w:jc w:val="start"/>
+              <w:rPr>
+                <w:rFonts w:eastAsia="ＭＳ 明朝" w:cs=""/>
+                <w:kern w:val="0"/>
+                <w:szCs w:val="22"/>
+                <w:lang w:val="en-US" w:eastAsia="en-US" w:bidi="ar-SA"/>
+              </w:rPr>
+            </w:pPr>
+            <w:r>
+              <w:rPr>
+                <w:b/>
+                <w:sz w:val="20"/>
+                <w:szCs w:val="20"/>
+              </w:rPr>
+              <w:t xml:space="preserve">UBS</w:t>
+            </w:r>
+          </w:p>
+        </w:tc>
+        <w:tc>
+          <w:tcPr>
+            <w:tcW w:w="4534" w:type="dxa"/>
+            <w:tcBorders/>
+          </w:tcPr>
+          <w:p>
+            <w:pPr>
+              <w:pStyle w:val="Normal"/>
+              <w:widowControl/>
+              <w:spacing w:lineRule="auto" w:line="240" w:before="0" w:after="0"/>
+              <w:jc w:val="start"/>
+              <w:rPr>
+                <w:rFonts w:eastAsia="ＭＳ 明朝" w:cs=""/>
+                <w:kern w:val="0"/>
+                <w:szCs w:val="22"/>
+                <w:lang w:val="en-US" w:eastAsia="en-US" w:bidi="ar-SA"/>
+              </w:rPr>
+            </w:pPr>
+            <w:r>
+              <w:rPr>
+                <w:sz w:val="20"/>
+                <w:szCs w:val="20"/>
+              </w:rPr>
+              <w:t xml:space="preserve">Unidade Básica de Saúde</w:t>
+            </w:r>
+          </w:p>
+        </w:tc>
+      </w:tr>
+      <w:tr>
+        <w:trPr/>
+        <w:tc>
+          <w:tcPr>
+            <w:tcW w:w="4535" w:type="dxa"/>
+            <w:tcBorders/>
+          </w:tcPr>
+          <w:p>
+            <w:pPr>
+              <w:pStyle w:val="Normal"/>
+              <w:widowControl/>
+              <w:spacing w:lineRule="auto" w:line="240" w:before="0" w:after="0"/>
+              <w:jc w:val="start"/>
+              <w:rPr>
+                <w:rFonts w:eastAsia="ＭＳ 明朝" w:cs=""/>
+                <w:kern w:val="0"/>
+                <w:szCs w:val="22"/>
+                <w:lang w:val="en-US" w:eastAsia="en-US" w:bidi="ar-SA"/>
+              </w:rPr>
+            </w:pPr>
+            <w:r>
+              <w:rPr>
+                <w:b/>
+                <w:sz w:val="20"/>
+                <w:szCs w:val="20"/>
+              </w:rPr>
+              <w:t xml:space="preserve">UUID</w:t>
+            </w:r>
+          </w:p>
+        </w:tc>
+        <w:tc>
+          <w:tcPr>
+            <w:tcW w:w="4534" w:type="dxa"/>
+            <w:tcBorders/>
+          </w:tcPr>
+          <w:p>
+            <w:pPr>
+              <w:pStyle w:val="Normal"/>
+              <w:widowControl/>
+              <w:spacing w:lineRule="auto" w:line="240" w:before="0" w:after="0"/>
+              <w:jc w:val="start"/>
+              <w:rPr>
+                <w:rFonts w:eastAsia="ＭＳ 明朝" w:cs=""/>
+                <w:kern w:val="0"/>
+                <w:szCs w:val="22"/>
+                <w:lang w:val="en-US" w:eastAsia="en-US" w:bidi="ar-SA"/>
+              </w:rPr>
+            </w:pPr>
+            <w:r>
+              <w:rPr>
+                <w:sz w:val="20"/>
+                <w:szCs w:val="20"/>
+              </w:rPr>
+              <w:t xml:space="preserve">Universally Unique Identifier</w:t>
+            </w:r>
+          </w:p>
+        </w:tc>
+      </w:tr>
+      <w:tr>
+        <w:trPr/>
+        <w:tc>
+          <w:tcPr>
+            <w:tcW w:w="4535" w:type="dxa"/>
+            <w:tcBorders/>
+          </w:tcPr>
+          <w:p>
+            <w:pPr>
+              <w:pStyle w:val="Normal"/>
+              <w:widowControl/>
+              <w:spacing w:lineRule="auto" w:line="240" w:before="0" w:after="0"/>
+              <w:jc w:val="start"/>
+              <w:rPr>
+                <w:rFonts w:eastAsia="ＭＳ 明朝" w:cs=""/>
+                <w:kern w:val="0"/>
+                <w:szCs w:val="22"/>
+                <w:lang w:val="en-US" w:eastAsia="en-US" w:bidi="ar-SA"/>
+              </w:rPr>
+            </w:pPr>
+            <w:r>
+              <w:rPr>
+                <w:b/>
+                <w:sz w:val="20"/>
+                <w:szCs w:val="20"/>
+              </w:rPr>
+              <w:t xml:space="preserve">WHO</w:t>
+            </w:r>
+          </w:p>
+        </w:tc>
+        <w:tc>
+          <w:tcPr>
+            <w:tcW w:w="4534" w:type="dxa"/>
+            <w:tcBorders/>
+          </w:tcPr>
+          <w:p>
+            <w:pPr>
+              <w:pStyle w:val="Normal"/>
+              <w:widowControl/>
+              <w:spacing w:lineRule="auto" w:line="240" w:before="0" w:after="0"/>
+              <w:jc w:val="start"/>
+              <w:rPr>
+                <w:rFonts w:eastAsia="ＭＳ 明朝" w:cs=""/>
+                <w:kern w:val="0"/>
+                <w:szCs w:val="22"/>
+                <w:lang w:val="en-US" w:eastAsia="en-US" w:bidi="ar-SA"/>
+              </w:rPr>
+            </w:pPr>
+            <w:r>
+              <w:rPr>
+                <w:sz w:val="20"/>
+                <w:szCs w:val="20"/>
+              </w:rPr>
+              <w:t xml:space="preserve">World Health Organization</w:t>
+            </w:r>
+          </w:p>
+        </w:tc>
+      </w:tr>
+      <w:tr>
+        <w:trPr/>
+        <w:tc>
+          <w:tcPr>
+            <w:tcW w:w="4535" w:type="dxa"/>
+            <w:tcBorders/>
+          </w:tcPr>
+          <w:p>
+            <w:pPr>
+              <w:pStyle w:val="Normal"/>
+              <w:widowControl/>
+              <w:spacing w:lineRule="auto" w:line="240" w:before="0" w:after="0"/>
+              <w:jc w:val="start"/>
+              <w:rPr>
+                <w:rFonts w:eastAsia="ＭＳ 明朝" w:cs=""/>
+                <w:kern w:val="0"/>
+                <w:szCs w:val="22"/>
+                <w:lang w:val="en-US" w:eastAsia="en-US" w:bidi="ar-SA"/>
+              </w:rPr>
+            </w:pPr>
+            <w:r>
+              <w:rPr>
+                <w:b/>
+                <w:sz w:val="20"/>
+                <w:szCs w:val="20"/>
+              </w:rPr>
+              <w:t xml:space="preserve">XGBoost</w:t>
+            </w:r>
+          </w:p>
+        </w:tc>
+        <w:tc>
+          <w:tcPr>
+            <w:tcW w:w="4534" w:type="dxa"/>
+            <w:tcBorders/>
+          </w:tcPr>
+          <w:p>
+            <w:pPr>
+              <w:pStyle w:val="Normal"/>
+              <w:widowControl/>
+              <w:spacing w:lineRule="auto" w:line="240" w:before="0" w:after="0"/>
+              <w:jc w:val="start"/>
+              <w:rPr>
+                <w:rFonts w:eastAsia="ＭＳ 明朝" w:cs=""/>
+                <w:kern w:val="0"/>
+                <w:szCs w:val="22"/>
+                <w:lang w:val="en-US" w:eastAsia="en-US" w:bidi="ar-SA"/>
+              </w:rPr>
+            </w:pPr>
+            <w:r>
+              <w:rPr>
+                <w:sz w:val="20"/>
+                <w:szCs w:val="20"/>
+              </w:rPr>
+              <w:t xml:space="preserve">Extreme Gradient Boosting</w:t>
             </w:r>
           </w:p>
         </w:tc>
@@ -4020,7 +4505,7 @@
           <w:i w:val="false"/>
           <w:sz w:val="24"/>
         </w:rPr>
-        <w:t>O acompanhamento pré-natal constitui um componente central da atenção à gestação e da promoção da saúde materno-infantil, sendo objeto de diretrizes internacionais que recomendam uma atenção organizada, periódica e centrada na gestante (OMS, 2016). No Brasil, essa atenção integra a política de saúde materno-infantil do Sistema Único de Saúde (SUS) e foi reafirmada, em sua configuração mais recente, pela Rede Alyne, instituída pela Portaria GM/MS nº 5.350, de 2024, que prevê a captação oportuna da gestante e a realização de um conjunto mínimo de consultas intercaladas entre diferentes profissionais (Brasil, 2024). A mortalidade materna permanece, todavia, um problema relevante em escala global (OMS, 2019, 2024), o que reforça a importância de estratégias que favoreçam a continuidade do acompanhamento.</w:t>
+        <w:t>O acompanhamento pré-natal constitui um componente central da atenção à gestação e da promoção da saúde materno-infantil, sendo objeto de diretrizes internacionais que recomendam uma atenção organizada, periódica e centrada na gestante (WORLD HEALTH ORGANIZATION, 2016). No Brasil, essa atenção integra a política de saúde materno-infantil do Sistema Único de Saúde (SUS) e foi reafirmada, em sua configuração mais recente, pela Rede Alyne, instituída pela Portaria GM/MS nº 5.350, de 2024, que prevê a captação oportuna da gestante e a realização de um conjunto mínimo de consultas intercaladas entre diferentes profissionais (Brasil, 2024). A mortalidade materna permanece, todavia, um problema relevante em escala global (WORLD HEALTH ORGANIZATION, 2019, 2024), o que reforça a importância de estratégias que favoreçam a continuidade do acompanhamento.</w:t>
       </w:r>
     </w:p>
     <w:p>
@@ -4056,7 +4541,7 @@
           <w:i w:val="false"/>
           <w:sz w:val="24"/>
         </w:rPr>
-        <w:t>Os Determinantes Sociais da Saúde (DSS) constituem o conjunto de condições sociais, econômicas e ambientais em que as pessoas nascem, vivem e trabalham e que moldam as oportunidades de saúde, gerando iniquidades evitáveis quando distribuídos de forma desigual (Buss; Pellegrini Filho, 2007; CNDSS, 2008; Solar; Irwin, 2010; OMS, 2025). No escopo deste trabalho, esses determinantes são operacionalizados em seis dimensões — educação, trabalho e renda, saneamento, acesso aos serviços de saúde, habitação e alimentação — que orientam a coleta estruturada de informações e a caracterização de perfis de vulnerabilidade social.</w:t>
+        <w:t>Os Determinantes Sociais da Saúde (DSS) constituem o conjunto de condições sociais, econômicas e ambientais em que as pessoas nascem, vivem e trabalham e que moldam as oportunidades de saúde, gerando iniquidades evitáveis quando distribuídos de forma desigual (Buss; Pellegrini Filho, 2007; CNDSS, 2008; Solar; Irwin, 2010; WORLD HEALTH ORGANIZATION, 2025). No escopo deste trabalho, esses determinantes são operacionalizados em seis dimensões — educação, trabalho e renda, saneamento, acesso aos serviços de saúde, habitação e alimentação — que orientam a coleta estruturada de informações e a caracterização de perfis de vulnerabilidade social.</w:t>
       </w:r>
     </w:p>
     <w:p>
@@ -4227,7 +4712,7 @@
           <w:i w:val="false"/>
           <w:sz w:val="24"/>
         </w:rPr>
-        <w:t>A relevância social deste trabalho reside na centralidade do pré-natal para a saúde materna e na persistência de desigualdades de acesso e de continuidade, documentadas para o contexto brasileiro (Rosa; Silveira; Costa, 2014; Viellas et al., 2014; Degli Esposti et al., 2020). A mortalidade materna permanece um problema relevante em escala global (OMS, 2019, 2024), e o acompanhamento pré-natal adequado figura entre as estratégias de prevenção recomendadas (OMS, 2016). Compreender como condições relacionadas aos DSS se associam às desigualdades observadas na adequação e na continuidade desse acompanhamento pode subsidiar o planejamento da atenção, ainda que este trabalho não se proponha a intervir diretamente sobre esse fenômeno nem a estabelecer relações de causalidade.</w:t>
+        <w:t>A relevância social deste trabalho reside na centralidade do pré-natal para a saúde materna e na persistência de desigualdades de acesso e de continuidade, documentadas para o contexto brasileiro (Rosa; Silveira; Costa, 2014; Viellas et al., 2014; Degli Esposti et al., 2020). A mortalidade materna permanece um problema relevante em escala global (WORLD HEALTH ORGANIZATION, 2019, 2024), e o acompanhamento pré-natal adequado figura entre as estratégias de prevenção recomendadas (WORLD HEALTH ORGANIZATION, 2016). Compreender como condições relacionadas aos DSS se associam às desigualdades observadas na adequação e na continuidade desse acompanhamento pode subsidiar o planejamento da atenção, ainda que este trabalho não se proponha a intervir diretamente sobre esse fenômeno nem a estabelecer relações de causalidade.</w:t>
       </w:r>
     </w:p>
     <w:p>
@@ -10849,6 +11334,21 @@
           <w:sz w:val="24"/>
         </w:rPr>
         <w:t>Nem todas as 48 respostas do questionário são utilizadas no modelo principal. A classificação consolidada das 48 variáveis é:</w:t>
+      </w:r>
+    </w:p>
+    <w:p>
+      <w:pPr>
+        <w:pStyle w:val="Normal"/>
+        <w:jc w:val="start"/>
+        <w:keepNext/>
+      </w:pPr>
+      <w:r>
+        <w:rPr>
+          <w:b/>
+          <w:sz w:val="20"/>
+          <w:szCs w:val="20"/>
+        </w:rPr>
+        <w:t xml:space="preserve">Quadro 1 – Classificação consolidada das 48 variáveis do questionário</w:t>
       </w:r>
     </w:p>
     <w:tbl>
@@ -12166,7 +12666,7 @@
           <w:i w:val="false"/>
           <w:sz w:val="24"/>
         </w:rPr>
-        <w:t xml:space="preserve"> (seção 6.2). Essa evolução metodológica — de uma proposta ampla para um protocolo fechado com três classificadores — é registrada aqui de forma explícita, sem que as técnicas não executadas sejam descritas como realizadas.</w:t>
+        <w:t xml:space="preserve"> (seção 5.2). Essa evolução metodológica — de uma proposta ampla para um protocolo fechado com três classificadores — é registrada aqui de forma explícita, sem que as técnicas não executadas sejam descritas como realizadas.</w:t>
       </w:r>
     </w:p>
     <w:p>
@@ -12829,7 +13329,7 @@
           <w:i w:val="false"/>
           <w:sz w:val="24"/>
         </w:rPr>
-        <w:t xml:space="preserve"> na validação cruzada (desempate por recall e F1), por ser mais adequada a cenários desbalanceados do que a accuracy. Os resultados são apresentados na seção 6.</w:t>
+        <w:t xml:space="preserve"> na validação cruzada (desempate por recall e F1), por ser mais adequada a cenários desbalanceados do que a accuracy. Os resultados são apresentados na seção 5.</w:t>
       </w:r>
     </w:p>
     <w:p>
@@ -13672,7 +14172,7 @@
           <w:i w:val="false"/>
           <w:sz w:val="24"/>
         </w:rPr>
-        <w:t xml:space="preserve"> (seção 6.3); isso é um resultado experimental e </w:t>
+        <w:t xml:space="preserve"> (seção 5.3); isso é um resultado experimental e </w:t>
       </w:r>
       <w:r>
         <w:rPr>
@@ -14164,6 +14664,21 @@
       <w:pPr/>
       <w:r>
         <w:t>O ramo superior representa o fluxo DSS atual, já operacional e independente de banco de dados. O ramo inferior representa a infraestrutura de persistência disponível — e, nesta etapa, ainda não conectada a entidades de acompanhamento: não há tabelas de domínio, nem persistência de consultas, exames, vacinas, medicamentos, gestações ou planos de parto. Essa infraestrutura emprega os seguintes componentes:</w:t>
+      </w:r>
+    </w:p>
+    <w:p>
+      <w:pPr>
+        <w:pStyle w:val="Normal"/>
+        <w:jc w:val="start"/>
+        <w:keepNext/>
+      </w:pPr>
+      <w:r>
+        <w:rPr>
+          <w:b/>
+          <w:sz w:val="20"/>
+          <w:szCs w:val="20"/>
+        </w:rPr>
+        <w:t xml:space="preserve">Quadro 2 – Componentes tecnológicos da infraestrutura de persistência do backend</w:t>
       </w:r>
     </w:p>
     <w:tbl>
@@ -16751,6 +17266,21 @@
           <w:sz w:val="24"/>
         </w:rPr>
         <w:t>:</w:t>
+      </w:r>
+    </w:p>
+    <w:p>
+      <w:pPr>
+        <w:pStyle w:val="Normal"/>
+        <w:jc w:val="start"/>
+        <w:keepNext/>
+      </w:pPr>
+      <w:r>
+        <w:rPr>
+          <w:b/>
+          <w:sz w:val="20"/>
+          <w:szCs w:val="20"/>
+        </w:rPr>
+        <w:t xml:space="preserve">Tabela 1 – Comparação dos modelos na validação cruzada</w:t>
       </w:r>
     </w:p>
     <w:tbl>
@@ -17309,6 +17839,21 @@
         <w:t xml:space="preserve"> no conjunto de teste (1.000 registros), após a seleção. Resultados históricos:</w:t>
       </w:r>
     </w:p>
+    <w:p>
+      <w:pPr>
+        <w:pStyle w:val="Normal"/>
+        <w:jc w:val="start"/>
+        <w:keepNext/>
+      </w:pPr>
+      <w:r>
+        <w:rPr>
+          <w:b/>
+          <w:sz w:val="20"/>
+          <w:szCs w:val="20"/>
+        </w:rPr>
+        <w:t xml:space="preserve">Tabela 2 – Desempenho do modelo selecionado no conjunto hold-out</w:t>
+      </w:r>
+    </w:p>
     <w:tbl>
       <w:tblPr>
         <w:tblStyle w:val="TableGrid"/>
@@ -17677,6 +18222,21 @@
         <w:t>No limiar de decisão 0,5, a matriz de confusão foi:</w:t>
       </w:r>
     </w:p>
+    <w:p>
+      <w:pPr>
+        <w:pStyle w:val="Normal"/>
+        <w:jc w:val="start"/>
+        <w:keepNext/>
+      </w:pPr>
+      <w:r>
+        <w:rPr>
+          <w:b/>
+          <w:sz w:val="20"/>
+          <w:szCs w:val="20"/>
+        </w:rPr>
+        <w:t xml:space="preserve">Tabela 3 – Matriz de confusão no limiar de referência 0,5</w:t>
+      </w:r>
+    </w:p>
     <w:tbl>
       <w:tblPr>
         <w:tblStyle w:val="TableGrid"/>
@@ -18345,6 +18905,20 @@
         </w:rPr>
         <w:t xml:space="preserve"> é uma medida exclusiva de calibração.</w:t>
       </w:r>
+      <w:r>
+        <w:rPr>
+          <w:b w:val="0"/>
+          <w:sz w:val="24"/>
+        </w:rPr>
+        <w:t xml:space="preserve"> </w:t>
+      </w:r>
+      <w:r>
+        <w:rPr>
+          <w:b w:val="0"/>
+          <w:sz w:val="24"/>
+        </w:rPr>
+        <w:t>Esse Brier out-of-fold (≈ 0,1789) distingue-se do Brier hold-out (≈ 0,1787) reportado na Tabela 2, calculado uma única vez sobre o conjunto de teste.</w:t>
+      </w:r>
     </w:p>
     <w:p>
       <w:pPr>
@@ -19399,6 +19973,7 @@
         <w:spacing w:before="120" w:after="80"/>
         <w:jc w:val="start"/>
         <w:rPr/>
+        <w:keepNext/>
       </w:pPr>
       <w:r>
         <w:rPr>

</xml_diff>

<commit_message>
docs: add obstetric history to TCC2
</commit_message>
<xml_diff>
--- a/docs/TCC2_MESTRE_Harliton_Martins.docx
+++ b/docs/TCC2_MESTRE_Harliton_Martins.docx
@@ -279,7 +279,7 @@
     </w:p>
     <w:p>
       <w:r>
-        <w:t>A descontinuidade do acompanhamento pré-natal configura um problema relevante para a saúde materna e está associada a condições sociais e a barreiras de acesso aos serviços de saúde. Este trabalho investiga, de forma experimental, o emprego de aprendizado de máquina supervisionado sobre variáveis estruturadas dos Determinantes Sociais da Saúde (DSS) para estimar a propensão à descontinuidade do acompanhamento pré-natal, integrando essa função a um aplicativo móvel e a um Índice de Vulnerabilidade dos DSS (IV-DSS). A pesquisa foi conduzida sobre um dataset sintético reproduzível (5.000 registros, seed fixa), gerado por um modelo probabilístico próprio, sem pretensão de validade clínica ou populacional. A solução foi desenvolvida com aplicativo Flutter, backend FastAPI e um pacote de aprendizado de máquina em Python; o domínio de acompanhamento foi modelado com as entidades GESTANTE e GESTAÇÃO, persistidas em PostgreSQL, com controle de propriedade dos dados e regra de gestação ativa única. Três classificadores — regressão logística, Random Forest e XGBoost — foram comparados por validação cruzada, e o Random Forest foi selecionado pela PR-AUC média. O desempenho permaneceu limitado (ROC-AUC ≈ 0,62; PR-AUC ≈ 0,34; recall zero no limiar 0,5), o que, somado à natureza sintética dos dados, impede leitura de capacidade preditiva validada. A integração Flutter → API → ML foi validada de ponta a ponta, e a suíte de testes da API encerrou com 299 testes aprovados. Os resultados evidenciam a consolidação de um pipeline experimental reproduzível — contrato de dados, geração controlada, protocolo de treinamento/validação, métricas para desbalanceamento e integração de software — como base metodológica a ser estendida a dados reais sob os devidos requisitos éticos.</w:t>
+        <w:t>A descontinuidade do acompanhamento pré-natal configura um problema relevante para a saúde materna e está associada a condições sociais e a barreiras de acesso aos serviços de saúde. Este trabalho investiga, de forma experimental, o emprego de aprendizado de máquina supervisionado sobre variáveis estruturadas dos Determinantes Sociais da Saúde (DSS) para estimar a propensão à descontinuidade do acompanhamento pré-natal, integrando essa função a um aplicativo móvel e a um Índice de Vulnerabilidade dos DSS (IV-DSS). A pesquisa foi conduzida sobre um dataset sintético reproduzível (5.000 registros, seed fixa), gerado por um modelo probabilístico próprio, sem pretensão de validade clínica ou populacional. A solução foi desenvolvida com aplicativo Flutter, backend FastAPI e um pacote de aprendizado de máquina em Python; o domínio de acompanhamento foi modelado com as entidades GESTANTE, GESTAÇÃO e HISTÓRICO OBSTÉTRICO, persistidas em PostgreSQL, com controle de propriedade dos dados e regra de gestação ativa única. Três classificadores — regressão logística, Random Forest e XGBoost — foram comparados por validação cruzada, e o Random Forest foi selecionado pela PR-AUC média. O desempenho permaneceu limitado (ROC-AUC ≈ 0,62; PR-AUC ≈ 0,34; recall zero no limiar 0,5), o que, somado à natureza sintética dos dados, impede leitura de capacidade preditiva validada. A integração Flutter → API → ML foi validada de ponta a ponta, e a suíte de testes da API encerrou com 323 testes aprovados. Os resultados evidenciam a consolidação de um pipeline experimental reproduzível — contrato de dados, geração controlada, protocolo de treinamento/validação, métricas para desbalanceamento e integração de software — como base metodológica a ser estendida a dados reais sob os devidos requisitos éticos.</w:t>
       </w:r>
     </w:p>
     <w:p>
@@ -315,7 +315,7 @@
     </w:p>
     <w:p>
       <w:r>
-        <w:t>Discontinuation of prenatal care constitutes a relevant problem for maternal health and is associated with social conditions and barriers to accessing health services. This work experimentally investigates the use of supervised machine learning over structured Social Determinants of Health (SDH) variables to estimate the propensity toward discontinuation of prenatal care, integrating this function into a mobile application and into an SDH Vulnerability Index (IV-DSS). The study was conducted on a reproducible synthetic dataset (5,000 records, fixed seed), generated by a custom probabilistic model, without any claim of clinical or population validity. The solution was developed with a Flutter application, a FastAPI backend, and a Python machine-learning package; the follow-up domain was modeled with the GESTANTE and GESTAÇÃO entities, persisted in PostgreSQL, with data-ownership control and a single-active-pregnancy rule. Three classifiers — logistic regression, Random Forest, and XGBoost — were compared through cross-validation, and Random Forest was selected by mean PR-AUC. Performance remained limited (ROC-AUC ≈ 0.62; PR-AUC ≈ 0.34; zero recall at the 0.5 threshold), which, together with the synthetic nature of the data, precludes any claim of validated predictive capacity. The Flutter → API → ML integration was validated end-to-end, and the API test suite ended with 299 passing tests. The results evidence the consolidation of a reproducible experimental pipeline — data contract, controlled generation, training/validation protocol, imbalance metrics, and software integration — as a methodological basis to be extended to real data under the appropriate ethical requirements.</w:t>
+        <w:t>Discontinuation of prenatal care constitutes a relevant problem for maternal health and is associated with social conditions and barriers to accessing health services. This work experimentally investigates the use of supervised machine learning over structured Social Determinants of Health (SDH) variables to estimate the propensity toward discontinuation of prenatal care, integrating this function into a mobile application and into an SDH Vulnerability Index (IV-DSS). The study was conducted on a reproducible synthetic dataset (5,000 records, fixed seed), generated by a custom probabilistic model, without any claim of clinical or population validity. The solution was developed with a Flutter application, a FastAPI backend, and a Python machine-learning package; the follow-up domain was modeled with the GESTANTE, GESTAÇÃO and HISTÓRICO OBSTÉTRICO entities, persisted in PostgreSQL, with data-ownership control and a single-active-pregnancy rule. Three classifiers — logistic regression, Random Forest, and XGBoost — were compared through cross-validation, and Random Forest was selected by mean PR-AUC. Performance remained limited (ROC-AUC ≈ 0.62; PR-AUC ≈ 0.34; zero recall at the 0.5 threshold), which, together with the synthetic nature of the data, precludes any claim of validated predictive capacity. The Flutter → API → ML integration was validated end-to-end, and the API test suite ended with 323 passing tests. The results evidence the consolidation of a reproducible experimental pipeline — data contract, controlled generation, training/validation protocol, imbalance metrics, and software integration — as a methodological basis to be extended to real data under the appropriate ethical requirements.</w:t>
       </w:r>
     </w:p>
     <w:p>
@@ -378,7 +378,7 @@
         <w:jc w:val="both"/>
       </w:pPr>
       <w:r>
-        <w:t>Figura 5 — Diagrama entidade-relacionamento do domínio de acompanhamento (USER → GESTANTE → GESTAÇÃO)</w:t>
+        <w:t>Figura 5 — Diagrama entidade-relacionamento do domínio de acompanhamento (USER → GESTANTE → HISTÓRICO OBSTÉTRICO e GESTAÇÃO)</w:t>
       </w:r>
     </w:p>
     <w:p>
@@ -16520,7 +16520,7 @@
     </w:p>
     <w:p>
       <w:r>
-        <w:t>Este capítulo descreve o estado implementado da solução. O eixo DSS encontra-se integrado de ponta a ponta a FastAPI e ao modelo de aprendizado de máquina; o backend dispõe de infraestrutura de persistência (PostgreSQL, SQLAlchemy e Alembic), de autenticação real e do domínio de acompanhamento pré-natal (GESTANTE e GESTAÇÃO), implementados e validados. O aplicativo Flutter, por sua vez, ainda persiste o acompanhamento localmente (SQLite), e a integração do aplicativo à nova API de acompanhamento permanece etapa futura (seção 4.7). A Figura 4 sintetiza essa arquitetura.</w:t>
+        <w:t>Este capítulo descreve o estado implementado da solução. O eixo DSS encontra-se integrado de ponta a ponta a FastAPI e ao modelo de aprendizado de máquina; o backend dispõe de infraestrutura de persistência (PostgreSQL, SQLAlchemy e Alembic), de autenticação real e do domínio de acompanhamento pré-natal (GESTANTE, GESTAÇÃO e HISTÓRICO OBSTÉTRICO), implementados e validados. O aplicativo Flutter, por sua vez, ainda persiste o acompanhamento localmente (SQLite), e a integração do aplicativo à nova API de acompanhamento permanece etapa futura (seção 4.7). A Figura 4 sintetiza essa arquitetura.</w:t>
       </w:r>
     </w:p>
     <w:p>
@@ -16815,7 +16815,7 @@
     </w:p>
     <w:p>
       <w:r>
-        <w:t>O backend conta, adicionalmente, com uma infraestrutura de persistência já implementada e validada, que recebeu as suas primeiras funcionalidades reais conectadas — a autenticação (seção 4.5) e o domínio de acompanhamento pré-natal (GESTANTE e GESTAÇÃO, seção 4.7) —, com as tabelas users, auth_refresh_sessions, gestantes e gestacoes no PostgreSQL. O aplicativo Flutter, por sua vez, ainda persiste o acompanhamento em SQLite local (seção 4.4). Essa infraestrutura organiza o acesso ao banco de dados relacional em uma camada própria da API, com ciclo de vida centralizado:</w:t>
+        <w:t>O backend conta, adicionalmente, com uma infraestrutura de persistência já implementada e validada, que recebeu as suas primeiras funcionalidades reais conectadas — a autenticação (seção 4.5) e o domínio de acompanhamento pré-natal (GESTANTE, GESTAÇÃO e HISTÓRICO OBSTÉTRICO, seção 4.7) —, com as tabelas users, auth_refresh_sessions, gestantes, gestacoes e historicos_obstetricos no PostgreSQL. O aplicativo Flutter, por sua vez, ainda persiste o acompanhamento em SQLite local (seção 4.4). Essa infraestrutura organiza o acesso ao banco de dados relacional em uma camada própria da API, com ciclo de vida centralizado:</w:t>
       </w:r>
     </w:p>
     <w:p>
@@ -16862,12 +16862,14 @@
       </w:r>
       <w:r>
         <w:br/>
-        <w:t xml:space="preserve">              0002 = gestantes + gestacoes)</w:t>
-      </w:r>
-    </w:p>
-    <w:p>
-      <w:r>
-        <w:t>O ramo superior representa o fluxo DSS atual, já operacional e independente de banco de dados. O ramo inferior representa a infraestrutura de persistência, que nesta etapa suporta a autenticação e o domínio de acompanhamento pré-natal. A migration 0001 criou as duas primeiras tabelas reais (users e auth_refresh_sessions) e a migration 0002 criou as tabelas do domínio de acompanhamento pré-natal (gestantes e gestacoes). Permanecem, contudo, não persistidas as demais entidades do acompanhamento (histórico obstétrico, consultas, exames, vacinas, medicamentos e plano de parto). Essa infraestrutura emprega os seguintes componentes:</w:t>
+        <w:t xml:space="preserve">              0002 = gestantes + gestacoes;</w:t>
+        <w:br/>
+        <w:t xml:space="preserve">              0003 = historicos_obstetricos)</w:t>
+      </w:r>
+    </w:p>
+    <w:p>
+      <w:r>
+        <w:t>O ramo superior representa o fluxo DSS atual, já operacional e independente de banco de dados. O ramo inferior representa a infraestrutura de persistência, que nesta etapa suporta a autenticação e o domínio de acompanhamento pré-natal. A migration 0001 criou as duas primeiras tabelas reais (users e auth_refresh_sessions), a migration 0002 criou as tabelas do domínio de acompanhamento pré-natal (gestantes e gestacoes) e a migration 0003 criou a tabela do histórico obstétrico (historicos_obstetricos). Permanecem, contudo, não persistidas as demais entidades do acompanhamento (consultas, exames, vacinas, medicamentos e plano de parto). Essa infraestrutura emprega os seguintes componentes:</w:t>
       </w:r>
     </w:p>
     <w:p>
@@ -17106,7 +17108,7 @@
         <w:jc w:val="both"/>
       </w:pPr>
       <w:r>
-        <w:t>A arquitetura aqui descrita corresponde ao estado implementado. Além da infraestrutura de persistência (PostgreSQL, SQLAlchemy e Alembic), o backend já conta com autenticação real — cadastro, login, access/refresh token, logout e consulta do usuário autenticado (/auth/me) — persistida nas tabelas users e auth_refresh_sessions (seção 4.5), e com o domínio de acompanhamento pré-natal — perfil GESTANTE e gestações (GESTAÇÃO) — persistido nas tabelas gestantes e gestacoes, com operações CRUD protegidas por propriedade de dados (seção 4.7). Distingue-se, portanto, a API DSS atual (que recebe a estimativa experimental, de forma stateless) da API CRUD do acompanhamento pré-natal, cujas entidades de domínio GESTANTE e GESTAÇÃO já foram implementadas e validadas; as demais entidades (histórico obstétrico, consultas, exames, vacinas, medicamentos e plano de parto) permanecem futuras (seção 4.7).</w:t>
+        <w:t>A arquitetura aqui descrita corresponde ao estado implementado. Além da infraestrutura de persistência (PostgreSQL, SQLAlchemy e Alembic), o backend já conta com autenticação real — cadastro, login, access/refresh token, logout e consulta do usuário autenticado (/auth/me) — persistida nas tabelas users e auth_refresh_sessions (seção 4.5), e com o domínio de acompanhamento pré-natal — perfil GESTANTE, gestações (GESTAÇÃO) e histórico obstétrico (HISTÓRICO OBSTÉTRICO) — persistido nas tabelas gestantes, gestacoes e historicos_obstetricos, com operações CRUD protegidas por propriedade de dados (seção 4.7). Distingue-se, portanto, a API DSS atual (que recebe a estimativa experimental, de forma stateless) da API CRUD do acompanhamento pré-natal, cujas entidades de domínio GESTANTE, GESTAÇÃO e HISTÓRICO OBSTÉTRICO já foram implementadas e validadas; as demais entidades (consultas, exames, vacinas, medicamentos e plano de parto) permanecem futuras (seção 4.7).</w:t>
       </w:r>
     </w:p>
     <w:p>
@@ -18136,7 +18138,7 @@
         <w:t>não</w:t>
       </w:r>
       <w:r>
-        <w:t xml:space="preserve"> contém dados clínicos/pessoais da gestante (nome, CPF, CNS, nascimento ou histórico obstétrico), que pertencem ao futuro domínio GESTANTE (seção 4.7). As </w:t>
+        <w:t xml:space="preserve"> contém dados clínicos/pessoais da gestante (nome, CPF, CNS, nascimento ou histórico obstétrico), que pertencem ao domínio GESTANTE (seção 4.7). As </w:t>
       </w:r>
       <w:r>
         <w:rPr>
@@ -18478,7 +18480,7 @@
         <w:jc w:val="both"/>
       </w:pPr>
       <w:r>
-        <w:t>A arquitetura descrita até aqui corresponde ao estado atual implementado — o aplicativo persiste o acompanhamento localmente em SQLite, o fluxo DSS utiliza a API apenas para a estimativa experimental (de forma stateless), e o backend já conta com autenticação real (seção 4.5) e com o domínio de acompanhamento pré-natal parcialmente implementado: as entidades GESTANTE e GESTAÇÃO, com persistência em PostgreSQL (migration 0002) e operações CRUD protegidas por propriedade de dados. A seguir apresentam-se as entidades e relacionamentos que estruturam o domínio, distinguindo o que já foi implementado do que permanece planejado. A Figura 5 apresenta o diagrama entidade-relacionamento correspondente.</w:t>
+        <w:t>A arquitetura descrita até aqui corresponde ao estado atual implementado — o aplicativo persiste o acompanhamento localmente em SQLite, o fluxo DSS utiliza a API apenas para a estimativa experimental (de forma stateless), e o backend já conta com autenticação real (seção 4.5) e com o domínio de acompanhamento pré-natal parcialmente implementado: as entidades GESTANTE, GESTAÇÃO e HISTÓRICO OBSTÉTRICO, com persistência em PostgreSQL (migrations 0002 e 0003) e operações CRUD protegidas por propriedade de dados. A seguir apresentam-se as entidades e relacionamentos que estruturam o domínio, distinguindo o que já foi implementado do que permanece planejado. A Figura 5 apresenta o diagrama entidade-relacionamento correspondente.</w:t>
       </w:r>
     </w:p>
     <w:p>
@@ -18508,7 +18510,7 @@
       </w:r>
       <w:r>
         <w:br/>
-        <w:t>GESTANTE 1 ─ 1 HISTORICO_OBSTETRICO     (planejado)</w:t>
+        <w:t>GESTANTE 1 ─ 1 HISTORICO_OBSTETRICO     (implementado — migration 0003)</w:t>
       </w:r>
       <w:r>
         <w:br/>
@@ -18545,8 +18547,7 @@
         <w:t xml:space="preserve">Nessa arquitetura, USER representa a identidade/autenticação e GESTANTE o perfil pessoal (nome, nome social, data de nascimento, CPF — se utilizado — e Cartão Nacional de </w:t>
       </w:r>
       <w:r>
-        <w:lastRenderedPageBreak/>
-        <w:t>Saúde); GESTAÇÃO representa cada gestação individual, com data da última menstruação, local do pré-natal, profissional, contato do local e data de encerramento (quando encerrada). O histórico obstétrico atual (números agregados de gravidezes, partos e abortos) pertence à GESTANTE e não representa uma gestação anterior individual, sendo modelado como HISTORICO_OBSTETRICO. Cada GESTACAO possui identidade própria, e as demais entidades do pré-natal (consultas, exames, medicamentos, vacinas, plano de parto e avaliação DSS) ficam associadas à gestação.</w:t>
+        <w:t>Saúde); GESTAÇÃO representa cada gestação individual, com data da última menstruação, local do pré-natal, profissional, contato do local e data de encerramento (quando encerrada). O histórico obstétrico atual — o número de gestações, o número de partos e o número de abortos — pertence à GESTANTE e não representa a gestação corrente nem uma gestação anterior individual, sendo modelado como HISTORICO_OBSTETRICO, em relacionamento 1—1 com a GESTANTE. Cada GESTACAO possui identidade própria, e as demais entidades do pré-natal (consultas, exames, medicamentos, vacinas, plano de parto e avaliação DSS) ficam associadas à gestação.</w:t>
       </w:r>
     </w:p>
     <w:p>
@@ -18556,7 +18557,7 @@
         <w:jc w:val="both"/>
       </w:pPr>
       <w:r>
-        <w:t>A persistência do domínio de acompanhamento adota PostgreSQL como banco, SQLAlchemy 2.x como camada ORM e Alembic para migrações versionadas, com integridade referencial formal (chaves estrangeiras), timestamps e identificadores UUID v4. A infraestrutura de persistência correspondente já foi implementada e validada — PostgreSQL 16, SQLAlchemy 2.x em modo síncrono e Alembic configurado (seções 4.1 e 5.9) — e a migration 0002 criou as tabelas gestantes e gestacoes, com o índice único parcial uq_gestacoes_active_per_gestante (gestante_id WHERE ended_at IS NULL), que garante uma única gestação ativa por gestante. Permanecem futuras as demais entidades de domínio (HISTORICO_OBSTETRICO, CONSULTA, EXAME, MEDICACAO, VACINA, PLANO_DE_PARTO, AVALIACAO_DSS), suas migrations e o CRUD correspondente. A adoção do modo síncrono decorreu da adequação às características desta solução — endpoints síncronos, ausência de demanda concreta por I/O concorrente intenso, menor complexidade de implementação e maior simplicidade em transações, testes e manutenção — sem que isso constitua juízo de que a abordagem assíncrona seja inferior em geral. O CPF, quando utilizado, pertence ao perfil da gestante e não é chave primária nem credencial de login automática.</w:t>
+        <w:t>A persistência do domínio de acompanhamento adota PostgreSQL como banco, SQLAlchemy 2.x como camada ORM e Alembic para migrações versionadas, com integridade referencial formal (chaves estrangeiras), timestamps e identificadores UUID v4. A infraestrutura de persistência correspondente já foi implementada e validada — PostgreSQL 16, SQLAlchemy 2.x em modo síncrono e Alembic configurado (seções 4.1 e 5.9) — e a migration 0002 criou as tabelas gestantes e gestacoes, com o índice único parcial uq_gestacoes_active_per_gestante (gestante_id WHERE ended_at IS NULL), que garante uma única gestação ativa por gestante, e a migration 0003 criou a tabela historicos_obstetricos, com chave estrangeira para gestantes e restrição UNIQUE em gestante_id (1—1). Permanecem futuras as demais entidades de domínio (CONSULTA, EXAME, MEDICACAO, VACINA, PLANO_DE_PARTO, AVALIACAO_DSS), suas migrations e o CRUD correspondente. A adoção do modo síncrono decorreu da adequação às características desta solução — endpoints síncronos, ausência de demanda concreta por I/O concorrente intenso, menor complexidade de implementação e maior simplicidade em transações, testes e manutenção — sem que isso constitua juízo de que a abordagem assíncrona seja inferior em geral. O CPF, quando utilizado, pertence ao perfil da gestante e não é chave primária nem credencial de login automática.</w:t>
       </w:r>
     </w:p>
     <w:p>
@@ -18566,7 +18567,7 @@
         <w:jc w:val="both"/>
       </w:pPr>
       <w:r>
-        <w:t>A API/backend constitui a fonte de verdade do acompanhamento pré-natal no backend, com autorização por propriedade de dados (ownership) aplicada pelo caminho USER → GESTANTE → GESTACAO, impedindo o acesso a registros de outra usuária — sobre a autenticação já implementada (seção 4.5). Para GESTANTE e GESTAÇÃO, essa autorização já foi implementada e validada: um usuário autenticado acessa exclusivamente o próprio perfil e as próprias gestações, e a tentativa de acessar registro alheio é indistinguível de recurso inexistente (404). Distinguem-se, assim, autenticação (“quem é a usuária”) — já implementada no backend — de autorização (“quais registros ela pode acessar”), que para o domínio GESTANTE/GESTAÇÃO já se encontra implementada; trata-se de controle de propriedade/autorização, e não de “multi-tenancy”.</w:t>
+        <w:t>A API/backend constitui a fonte de verdade do acompanhamento pré-natal no backend, com autorização por propriedade de dados (ownership) aplicada pelo caminho USER → GESTANTE → {GESTACAO, HISTÓRICO OBSTÉTRICO}, impedindo o acesso a registros de outra usuária — sobre a autenticação já implementada (seção 4.5). Para GESTANTE, GESTAÇÃO e HISTÓRICO OBSTÉTRICO, essa autorização já foi implementada e validada: um usuário autenticado acessa exclusivamente o próprio perfil, as próprias gestações e o próprio histórico obstétrico, e a tentativa de acessar registro alheio é indistinguível de recurso inexistente (404). O histórico obstétrico é acessado por GET e PUT em /api/v1/gestantes/me/historico-obstetrico; o PUT opera como UPSERT de singleton — a primeira escrita cria o registro e as seguintes atualizam a mesma linha, preservando o identificador e o vínculo com a GESTANTE. Distinguem-se, assim, autenticação (“quem é a usuária”) — já implementada no backend — de autorização (“quais registros ela pode acessar”), que para o domínio GESTANTE/GESTAÇÃO/HISTÓRICO OBSTÉTRICO já se encontra implementada; trata-se de controle de propriedade/autorização, e não de “multi-tenancy”.</w:t>
       </w:r>
     </w:p>
     <w:p>
@@ -18576,13 +18577,12 @@
         <w:jc w:val="both"/>
       </w:pPr>
       <w:r>
-        <w:lastRenderedPageBreak/>
-        <w:t>A transição do SQLite para a API será incremental, feature por feature: cada recurso migra da implementação local para a implementação REST, validado de ponta a ponta, e só então a API passa a ser a fonte de verdade daquela feature. As primeiras features a migrar — o perfil da gestante (GESTANTE) e a gestação corrente (GESTAÇÃO) — já foram implementadas e validadas no backend. Não haverá, nesta etapa, migração automática dos registros SQLite existentes, nem offline-first, sincronização ou cache distribuído; essas capacidades poderão ser avaliadas apenas posteriormente.</w:t>
-      </w:r>
-    </w:p>
-    <w:p>
-      <w:r>
-        <w:t>Em síntese, esta subseção registra uma arquitetura de domínio da qual já se encontram implementados e validados no backend: a autenticação (USER e AUTH_REFRESH_SESSION, seções 4.5 e 5.9) e as entidades GESTANTE e GESTAÇÃO, com persistência (migration 0002), regra de gestação ativa única e autorização por propriedade de dados (seções 4.7 e 5.9). As demais entidades (histórico obstétrico, consultas, exames, medicamentos, vacinas, plano de parto e avaliação DSS) permanecem planejadas. O fluxo DSS (POST /api/v1/risk-estimate) permanece inalterado: stateless, sem autenticação e sem persistência operacional.</w:t>
+        <w:t>A transição do SQLite para a API será incremental, feature por feature: cada recurso migra da implementação local para a implementação REST, validado de ponta a ponta, e só então a API passa a ser a fonte de verdade daquela feature. As primeiras features a migrar — o perfil da gestante (GESTANTE), a gestação corrente (GESTAÇÃO) e o histórico obstétrico (HISTÓRICO OBSTÉTRICO) — já foram implementadas e validadas no backend. Não haverá, nesta etapa, migração automática dos registros SQLite existentes, nem offline-first, sincronização ou cache distribuído; essas capacidades poderão ser avaliadas apenas posteriormente.</w:t>
+      </w:r>
+    </w:p>
+    <w:p>
+      <w:r>
+        <w:t>Em síntese, esta subseção registra uma arquitetura de domínio da qual já se encontram implementados e validados no backend: a autenticação (USER e AUTH_REFRESH_SESSION, seções 4.5 e 5.9) e as entidades GESTANTE, GESTAÇÃO e HISTÓRICO OBSTÉTRICO, com persistência (migrations 0002 e 0003), regra de gestação ativa única e autorização por propriedade de dados (seções 4.7 e 5.9). As demais entidades (consultas, exames, medicamentos, vacinas, plano de parto e avaliação DSS) permanecem planejadas. O fluxo DSS (POST /api/v1/risk-estimate) permanece inalterado: stateless, sem autenticação e sem persistência operacional.</w:t>
       </w:r>
     </w:p>
     <w:p>
@@ -18595,8 +18595,7 @@
         <w:jc w:val="center"/>
       </w:pPr>
       <w:r>
-        <w:lastRenderedPageBreak/>
-        <w:t>Figura 5 — Diagrama entidade-relacionamento do domínio de acompanhamento (USER → GESTANTE → GESTAÇÃO)</w:t>
+        <w:t>Figura 5 — Diagrama entidade-relacionamento do domínio de acompanhamento (USER → GESTANTE → HISTÓRICO OBSTÉTRICO e GESTAÇÃO)</w:t>
       </w:r>
     </w:p>
     <w:p>
@@ -21322,7 +21321,7 @@
     </w:p>
     <w:p>
       <w:r>
-        <w:t>A suíte de testes da API encerrou com 299 testes aprovados, 0 falhas e 0 pulados, incluindo testes de autenticação e do domínio GESTANTE/GESTAÇÃO contra PostgreSQL real (banco meu_bebe_test, nunca SQLite). Um smoke HTTP real validou o fluxo register → me → refresh → rejeição do refresh antigo → me com novo access → logout → rejeição do refresh revogado. Reitera-se que esses testes validam a implementação de software, e não a validade clínica do modelo de ML.</w:t>
+        <w:t>A suíte de testes da API encerrou com 323 testes aprovados, 0 falhas e 0 pulados, incluindo testes de autenticação e do domínio GESTANTE/GESTAÇÃO/HISTÓRICO OBSTÉTRICO contra PostgreSQL real (banco meu_bebe_test, nunca SQLite). Um smoke HTTP real validou o fluxo register → me → refresh → rejeição do refresh antigo → me com novo access → logout → rejeição do refresh revogado. No histórico obstétrico, os testes cobrem o UPSERT de singleton (criação na primeira escrita e atualização da mesma linha nas seguintes, preservando o identificador), a rejeição de campos indevidos e de contagens negativas (422) e o isolamento de propriedade entre usuárias. Reitera-se que esses testes validam a implementação de software, e não a validade clínica do modelo de ML.</w:t>
       </w:r>
     </w:p>
     <w:p>
@@ -21955,11 +21954,10 @@
         <w:jc w:val="both"/>
       </w:pPr>
       <w:r>
-        <w:t xml:space="preserve">Foram desenvolvidos: um contrato de dados canônico e versionado (schema 1.13, 6 dimensões, 48 variáveis); um índice descritivo experimental de vulnerabilidade (IV-DSS); um dataset sintético reproduzível (5.000 registros); um protocolo de treinamento/validação com controle de leakage; a comparação de três modelos e a seleção do Random Forest; análises de calibração, sensibilidade e interpretabilidade; a integração de software Flutter ↔ FastAPI ↔ IA, validada de ponta a ponta; a infraestrutura de persistência do backend (PostgreSQL 16, SQLAlchemy 2.x e Alembic); e a autenticação (JWT, Argon2id) e o domínio de acompanhamento pré-natal — entidades GESTANTE e GESTAÇÃO, com persistência </w:t>
-      </w:r>
-      <w:r>
-        <w:lastRenderedPageBreak/>
-        <w:t>(migration 0002), regra de gestação ativa única e autorização por propriedade de dados —, implementados e validados contra PostgreSQL real.</w:t>
+        <w:t xml:space="preserve">Foram desenvolvidos: um contrato de dados canônico e versionado (schema 1.13, 6 dimensões, 48 variáveis); um índice descritivo experimental de vulnerabilidade (IV-DSS); um dataset sintético reproduzível (5.000 registros); um protocolo de treinamento/validação com controle de leakage; a comparação de três modelos e a seleção do Random Forest; análises de calibração, sensibilidade e interpretabilidade; a integração de software Flutter ↔ FastAPI ↔ IA, validada de ponta a ponta; a infraestrutura de persistência do backend (PostgreSQL 16, SQLAlchemy 2.x e Alembic); e a autenticação (JWT, Argon2id) e o domínio de acompanhamento pré-natal — entidades GESTANTE, GESTAÇÃO e HISTÓRICO OBSTÉTRICO, com persistência </w:t>
+      </w:r>
+      <w:r>
+        <w:t>(migrations 0002 e 0003), regra de gestação ativa única e autorização por propriedade de dados —, implementados e validados contra PostgreSQL real.</w:t>
       </w:r>
     </w:p>
     <w:p>
@@ -22047,7 +22045,7 @@
         <w:jc w:val="both"/>
       </w:pPr>
       <w:r>
-        <w:t>Entre as limitações, destacam-se: uso de dados sintéticos (sem validade externa), ausência de validação clínica, recall zero no limiar 0,5, autenticação e domínio GESTANTE/GESTAÇÃO implementados apenas no backend (ainda não integrados ao aplicativo Flutter, que mantém a persistência local monousuária; o token de acesso permanece válido até expirar mesmo após o logout), e a ausência de relacionamentos formais na persistência local.</w:t>
+        <w:t>Entre as limitações, destacam-se: uso de dados sintéticos (sem validade externa), ausência de validação clínica, recall zero no limiar 0,5, autenticação e domínio GESTANTE/GESTAÇÃO/HISTÓRICO OBSTÉTRICO implementados apenas no backend (ainda não integrados ao aplicativo Flutter, que mantém a persistência local monousuária; o token de acesso permanece válido até expirar mesmo após o logout), e a ausência de relacionamentos formais na persistência local.</w:t>
       </w:r>
     </w:p>
     <w:p>
@@ -22057,7 +22055,7 @@
         <w:jc w:val="both"/>
       </w:pPr>
       <w:r>
-        <w:t>O problema da descontinuidade do pré-natal não foi resolvido; este trabalho estabeleceu, antes, uma base metodológica e tecnológica experimental que poderá ser estendida a dados reais. Como trabalhos futuros, indicam-se: a operacionalização longitudinal do desfecho com dados reais (fundamentada e ajustada pela duração gestacional); a implementação das demais entidades de domínio do acompanhamento (histórico obstétrico, consultas, exames, medicamentos, vacinas, plano de parto e avaliação DSS) e do CRUD correspondente (seção 4.7) — cuja infraestrutura de persistência, assim como a autenticação e o domínio GESTANTE/GESTAÇÃO, já foi implementada e validada no backend —; a integração do aplicativo Flutter com a autenticação e com a API de acompanhamento já existentes; e a condução de estudos com dados reais sob os devidos requisitos éticos e de consentimento.</w:t>
+        <w:t>O problema da descontinuidade do pré-natal não foi resolvido; este trabalho estabeleceu, antes, uma base metodológica e tecnológica experimental que poderá ser estendida a dados reais. Como trabalhos futuros, indicam-se: a operacionalização longitudinal do desfecho com dados reais (fundamentada e ajustada pela duração gestacional); a implementação das demais entidades de domínio do acompanhamento (consultas, exames, medicamentos, vacinas, plano de parto e avaliação DSS) e do CRUD correspondente (seção 4.7) — cuja infraestrutura de persistência, assim como a autenticação e o domínio GESTANTE/GESTAÇÃO/HISTÓRICO OBSTÉTRICO, já foi implementada e validada no backend —; a integração do aplicativo Flutter com a autenticação e com a API de acompanhamento já existentes; e a condução de estudos com dados reais sob os devidos requisitos éticos e de consentimento.</w:t>
       </w:r>
     </w:p>
     <w:p>

</xml_diff>